<commit_message>
idk thesis docx update but its deprecated
</commit_message>
<xml_diff>
--- a/docs/Master_thesis.docx
+++ b/docs/Master_thesis.docx
@@ -430,7 +430,7 @@
         </w:rPr>
         <w:fldChar w:fldCharType="separate"/>
       </w:r>
-      <w:hyperlink w:anchor="_Toc223961388" w:history="1">
+      <w:hyperlink w:anchor="_Toc225722856" w:history="1">
         <w:r>
           <w:rPr>
             <w:rStyle w:val="Hyperlink"/>
@@ -475,7 +475,7 @@
             <w:noProof/>
             <w:webHidden/>
           </w:rPr>
-          <w:instrText xml:space="preserve"> PAGEREF _Toc223961388 \h </w:instrText>
+          <w:instrText xml:space="preserve"> PAGEREF _Toc225722856 \h </w:instrText>
         </w:r>
         <w:r>
           <w:rPr>
@@ -522,7 +522,7 @@
           <w14:ligatures w14:val="standardContextual"/>
         </w:rPr>
       </w:pPr>
-      <w:hyperlink w:anchor="_Toc223961389" w:history="1">
+      <w:hyperlink w:anchor="_Toc225722857" w:history="1">
         <w:r>
           <w:rPr>
             <w:rStyle w:val="Hyperlink"/>
@@ -571,7 +571,7 @@
             <w:noProof/>
             <w:webHidden/>
           </w:rPr>
-          <w:instrText xml:space="preserve"> PAGEREF _Toc223961389 \h </w:instrText>
+          <w:instrText xml:space="preserve"> PAGEREF _Toc225722857 \h </w:instrText>
         </w:r>
         <w:r>
           <w:rPr>
@@ -618,7 +618,7 @@
           <w14:ligatures w14:val="standardContextual"/>
         </w:rPr>
       </w:pPr>
-      <w:hyperlink w:anchor="_Toc223961390" w:history="1">
+      <w:hyperlink w:anchor="_Toc225722858" w:history="1">
         <w:r>
           <w:rPr>
             <w:rStyle w:val="Hyperlink"/>
@@ -667,7 +667,7 @@
             <w:noProof/>
             <w:webHidden/>
           </w:rPr>
-          <w:instrText xml:space="preserve"> PAGEREF _Toc223961390 \h </w:instrText>
+          <w:instrText xml:space="preserve"> PAGEREF _Toc225722858 \h </w:instrText>
         </w:r>
         <w:r>
           <w:rPr>
@@ -714,7 +714,7 @@
           <w14:ligatures w14:val="standardContextual"/>
         </w:rPr>
       </w:pPr>
-      <w:hyperlink w:anchor="_Toc223961391" w:history="1">
+      <w:hyperlink w:anchor="_Toc225722859" w:history="1">
         <w:r>
           <w:rPr>
             <w:rStyle w:val="Hyperlink"/>
@@ -759,7 +759,7 @@
             <w:noProof/>
             <w:webHidden/>
           </w:rPr>
-          <w:instrText xml:space="preserve"> PAGEREF _Toc223961391 \h </w:instrText>
+          <w:instrText xml:space="preserve"> PAGEREF _Toc225722859 \h </w:instrText>
         </w:r>
         <w:r>
           <w:rPr>
@@ -806,7 +806,7 @@
           <w14:ligatures w14:val="standardContextual"/>
         </w:rPr>
       </w:pPr>
-      <w:hyperlink w:anchor="_Toc223961392" w:history="1">
+      <w:hyperlink w:anchor="_Toc225722860" w:history="1">
         <w:r>
           <w:rPr>
             <w:rStyle w:val="Hyperlink"/>
@@ -855,7 +855,7 @@
             <w:noProof/>
             <w:webHidden/>
           </w:rPr>
-          <w:instrText xml:space="preserve"> PAGEREF _Toc223961392 \h </w:instrText>
+          <w:instrText xml:space="preserve"> PAGEREF _Toc225722860 \h </w:instrText>
         </w:r>
         <w:r>
           <w:rPr>
@@ -902,7 +902,7 @@
           <w14:ligatures w14:val="standardContextual"/>
         </w:rPr>
       </w:pPr>
-      <w:hyperlink w:anchor="_Toc223961393" w:history="1">
+      <w:hyperlink w:anchor="_Toc225722861" w:history="1">
         <w:r>
           <w:rPr>
             <w:rStyle w:val="Hyperlink"/>
@@ -951,7 +951,7 @@
             <w:noProof/>
             <w:webHidden/>
           </w:rPr>
-          <w:instrText xml:space="preserve"> PAGEREF _Toc223961393 \h </w:instrText>
+          <w:instrText xml:space="preserve"> PAGEREF _Toc225722861 \h </w:instrText>
         </w:r>
         <w:r>
           <w:rPr>
@@ -998,7 +998,7 @@
           <w14:ligatures w14:val="standardContextual"/>
         </w:rPr>
       </w:pPr>
-      <w:hyperlink w:anchor="_Toc223961394" w:history="1">
+      <w:hyperlink w:anchor="_Toc225722862" w:history="1">
         <w:r>
           <w:rPr>
             <w:rStyle w:val="Hyperlink"/>
@@ -1047,7 +1047,7 @@
             <w:noProof/>
             <w:webHidden/>
           </w:rPr>
-          <w:instrText xml:space="preserve"> PAGEREF _Toc223961394 \h </w:instrText>
+          <w:instrText xml:space="preserve"> PAGEREF _Toc225722862 \h </w:instrText>
         </w:r>
         <w:r>
           <w:rPr>
@@ -1094,7 +1094,7 @@
           <w14:ligatures w14:val="standardContextual"/>
         </w:rPr>
       </w:pPr>
-      <w:hyperlink w:anchor="_Toc223961395" w:history="1">
+      <w:hyperlink w:anchor="_Toc225722863" w:history="1">
         <w:r>
           <w:rPr>
             <w:rStyle w:val="Hyperlink"/>
@@ -1143,7 +1143,7 @@
             <w:noProof/>
             <w:webHidden/>
           </w:rPr>
-          <w:instrText xml:space="preserve"> PAGEREF _Toc223961395 \h </w:instrText>
+          <w:instrText xml:space="preserve"> PAGEREF _Toc225722863 \h </w:instrText>
         </w:r>
         <w:r>
           <w:rPr>
@@ -1190,7 +1190,7 @@
           <w14:ligatures w14:val="standardContextual"/>
         </w:rPr>
       </w:pPr>
-      <w:hyperlink w:anchor="_Toc223961396" w:history="1">
+      <w:hyperlink w:anchor="_Toc225722864" w:history="1">
         <w:r>
           <w:rPr>
             <w:rStyle w:val="Hyperlink"/>
@@ -1239,7 +1239,7 @@
             <w:noProof/>
             <w:webHidden/>
           </w:rPr>
-          <w:instrText xml:space="preserve"> PAGEREF _Toc223961396 \h </w:instrText>
+          <w:instrText xml:space="preserve"> PAGEREF _Toc225722864 \h </w:instrText>
         </w:r>
         <w:r>
           <w:rPr>
@@ -1285,7 +1285,7 @@
           <w14:ligatures w14:val="standardContextual"/>
         </w:rPr>
       </w:pPr>
-      <w:hyperlink w:anchor="_Toc223961397" w:history="1">
+      <w:hyperlink w:anchor="_Toc225722865" w:history="1">
         <w:r>
           <w:rPr>
             <w:rStyle w:val="Hyperlink"/>
@@ -1324,7 +1324,7 @@
             <w:noProof/>
             <w:webHidden/>
           </w:rPr>
-          <w:instrText xml:space="preserve"> PAGEREF _Toc223961397 \h </w:instrText>
+          <w:instrText xml:space="preserve"> PAGEREF _Toc225722865 \h </w:instrText>
         </w:r>
         <w:r>
           <w:rPr>
@@ -1371,7 +1371,7 @@
           <w14:ligatures w14:val="standardContextual"/>
         </w:rPr>
       </w:pPr>
-      <w:hyperlink w:anchor="_Toc223961398" w:history="1">
+      <w:hyperlink w:anchor="_Toc225722866" w:history="1">
         <w:r>
           <w:rPr>
             <w:rStyle w:val="Hyperlink"/>
@@ -1429,7 +1429,7 @@
             <w:noProof/>
             <w:webHidden/>
           </w:rPr>
-          <w:instrText xml:space="preserve"> PAGEREF _Toc223961398 \h </w:instrText>
+          <w:instrText xml:space="preserve"> PAGEREF _Toc225722866 \h </w:instrText>
         </w:r>
         <w:r>
           <w:rPr>
@@ -1476,7 +1476,7 @@
           <w14:ligatures w14:val="standardContextual"/>
         </w:rPr>
       </w:pPr>
-      <w:hyperlink w:anchor="_Toc223961399" w:history="1">
+      <w:hyperlink w:anchor="_Toc225722867" w:history="1">
         <w:r>
           <w:rPr>
             <w:rStyle w:val="Hyperlink"/>
@@ -1525,7 +1525,7 @@
             <w:noProof/>
             <w:webHidden/>
           </w:rPr>
-          <w:instrText xml:space="preserve"> PAGEREF _Toc223961399 \h </w:instrText>
+          <w:instrText xml:space="preserve"> PAGEREF _Toc225722867 \h </w:instrText>
         </w:r>
         <w:r>
           <w:rPr>
@@ -1572,7 +1572,7 @@
           <w14:ligatures w14:val="standardContextual"/>
         </w:rPr>
       </w:pPr>
-      <w:hyperlink w:anchor="_Toc223961400" w:history="1">
+      <w:hyperlink w:anchor="_Toc225722868" w:history="1">
         <w:r>
           <w:rPr>
             <w:rStyle w:val="Hyperlink"/>
@@ -1621,7 +1621,7 @@
             <w:noProof/>
             <w:webHidden/>
           </w:rPr>
-          <w:instrText xml:space="preserve"> PAGEREF _Toc223961400 \h </w:instrText>
+          <w:instrText xml:space="preserve"> PAGEREF _Toc225722868 \h </w:instrText>
         </w:r>
         <w:r>
           <w:rPr>
@@ -1668,7 +1668,7 @@
           <w14:ligatures w14:val="standardContextual"/>
         </w:rPr>
       </w:pPr>
-      <w:hyperlink w:anchor="_Toc223961401" w:history="1">
+      <w:hyperlink w:anchor="_Toc225722869" w:history="1">
         <w:r>
           <w:rPr>
             <w:rStyle w:val="Hyperlink"/>
@@ -1717,7 +1717,7 @@
             <w:noProof/>
             <w:webHidden/>
           </w:rPr>
-          <w:instrText xml:space="preserve"> PAGEREF _Toc223961401 \h </w:instrText>
+          <w:instrText xml:space="preserve"> PAGEREF _Toc225722869 \h </w:instrText>
         </w:r>
         <w:r>
           <w:rPr>
@@ -1764,7 +1764,7 @@
           <w14:ligatures w14:val="standardContextual"/>
         </w:rPr>
       </w:pPr>
-      <w:hyperlink w:anchor="_Toc223961402" w:history="1">
+      <w:hyperlink w:anchor="_Toc225722870" w:history="1">
         <w:r>
           <w:rPr>
             <w:rStyle w:val="Hyperlink"/>
@@ -1813,7 +1813,7 @@
             <w:noProof/>
             <w:webHidden/>
           </w:rPr>
-          <w:instrText xml:space="preserve"> PAGEREF _Toc223961402 \h </w:instrText>
+          <w:instrText xml:space="preserve"> PAGEREF _Toc225722870 \h </w:instrText>
         </w:r>
         <w:r>
           <w:rPr>
@@ -1860,7 +1860,7 @@
           <w14:ligatures w14:val="standardContextual"/>
         </w:rPr>
       </w:pPr>
-      <w:hyperlink w:anchor="_Toc223961403" w:history="1">
+      <w:hyperlink w:anchor="_Toc225722871" w:history="1">
         <w:r>
           <w:rPr>
             <w:rStyle w:val="Hyperlink"/>
@@ -1909,7 +1909,7 @@
             <w:noProof/>
             <w:webHidden/>
           </w:rPr>
-          <w:instrText xml:space="preserve"> PAGEREF _Toc223961403 \h </w:instrText>
+          <w:instrText xml:space="preserve"> PAGEREF _Toc225722871 \h </w:instrText>
         </w:r>
         <w:r>
           <w:rPr>
@@ -1956,7 +1956,7 @@
           <w14:ligatures w14:val="standardContextual"/>
         </w:rPr>
       </w:pPr>
-      <w:hyperlink w:anchor="_Toc223961404" w:history="1">
+      <w:hyperlink w:anchor="_Toc225722872" w:history="1">
         <w:r>
           <w:rPr>
             <w:rStyle w:val="Hyperlink"/>
@@ -2005,7 +2005,7 @@
             <w:noProof/>
             <w:webHidden/>
           </w:rPr>
-          <w:instrText xml:space="preserve"> PAGEREF _Toc223961404 \h </w:instrText>
+          <w:instrText xml:space="preserve"> PAGEREF _Toc225722872 \h </w:instrText>
         </w:r>
         <w:r>
           <w:rPr>
@@ -2052,7 +2052,7 @@
           <w14:ligatures w14:val="standardContextual"/>
         </w:rPr>
       </w:pPr>
-      <w:hyperlink w:anchor="_Toc223961405" w:history="1">
+      <w:hyperlink w:anchor="_Toc225722873" w:history="1">
         <w:r>
           <w:rPr>
             <w:rStyle w:val="Hyperlink"/>
@@ -2101,7 +2101,7 @@
             <w:noProof/>
             <w:webHidden/>
           </w:rPr>
-          <w:instrText xml:space="preserve"> PAGEREF _Toc223961405 \h </w:instrText>
+          <w:instrText xml:space="preserve"> PAGEREF _Toc225722873 \h </w:instrText>
         </w:r>
         <w:r>
           <w:rPr>
@@ -2148,7 +2148,7 @@
           <w14:ligatures w14:val="standardContextual"/>
         </w:rPr>
       </w:pPr>
-      <w:hyperlink w:anchor="_Toc223961406" w:history="1">
+      <w:hyperlink w:anchor="_Toc225722874" w:history="1">
         <w:r>
           <w:rPr>
             <w:rStyle w:val="Hyperlink"/>
@@ -2197,7 +2197,7 @@
             <w:noProof/>
             <w:webHidden/>
           </w:rPr>
-          <w:instrText xml:space="preserve"> PAGEREF _Toc223961406 \h </w:instrText>
+          <w:instrText xml:space="preserve"> PAGEREF _Toc225722874 \h </w:instrText>
         </w:r>
         <w:r>
           <w:rPr>
@@ -2244,7 +2244,7 @@
           <w14:ligatures w14:val="standardContextual"/>
         </w:rPr>
       </w:pPr>
-      <w:hyperlink w:anchor="_Toc223961407" w:history="1">
+      <w:hyperlink w:anchor="_Toc225722875" w:history="1">
         <w:r>
           <w:rPr>
             <w:rStyle w:val="Hyperlink"/>
@@ -2268,7 +2268,7 @@
             <w:rStyle w:val="Hyperlink"/>
             <w:noProof/>
           </w:rPr>
-          <w:t>Datové zdroje</w:t>
+          <w:t>Zdroj dat</w:t>
         </w:r>
         <w:r>
           <w:rPr>
@@ -2289,7 +2289,7 @@
             <w:noProof/>
             <w:webHidden/>
           </w:rPr>
-          <w:instrText xml:space="preserve"> PAGEREF _Toc223961407 \h </w:instrText>
+          <w:instrText xml:space="preserve"> PAGEREF _Toc225722875 \h </w:instrText>
         </w:r>
         <w:r>
           <w:rPr>
@@ -2336,7 +2336,7 @@
           <w14:ligatures w14:val="standardContextual"/>
         </w:rPr>
       </w:pPr>
-      <w:hyperlink w:anchor="_Toc223961408" w:history="1">
+      <w:hyperlink w:anchor="_Toc225722876" w:history="1">
         <w:r>
           <w:rPr>
             <w:rStyle w:val="Hyperlink"/>
@@ -2364,7 +2364,7 @@
             <w:noProof/>
             <w:lang w:eastAsia="cs-CZ"/>
           </w:rPr>
-          <w:t>Metodologie klasifikace AI pozic</w:t>
+          <w:t>Extrakce dat a klasifikace AI pozic</w:t>
         </w:r>
         <w:r>
           <w:rPr>
@@ -2385,7 +2385,7 @@
             <w:noProof/>
             <w:webHidden/>
           </w:rPr>
-          <w:instrText xml:space="preserve"> PAGEREF _Toc223961408 \h </w:instrText>
+          <w:instrText xml:space="preserve"> PAGEREF _Toc225722876 \h </w:instrText>
         </w:r>
         <w:r>
           <w:rPr>
@@ -2432,7 +2432,7 @@
           <w14:ligatures w14:val="standardContextual"/>
         </w:rPr>
       </w:pPr>
-      <w:hyperlink w:anchor="_Toc223961409" w:history="1">
+      <w:hyperlink w:anchor="_Toc225722877" w:history="1">
         <w:r>
           <w:rPr>
             <w:rStyle w:val="Hyperlink"/>
@@ -2456,7 +2456,7 @@
             <w:rStyle w:val="Hyperlink"/>
             <w:noProof/>
           </w:rPr>
-          <w:t>Struktura datasetu a popis proměnných</w:t>
+          <w:t>Struktura datasetu a konstrukce proměnných</w:t>
         </w:r>
         <w:r>
           <w:rPr>
@@ -2477,7 +2477,7 @@
             <w:noProof/>
             <w:webHidden/>
           </w:rPr>
-          <w:instrText xml:space="preserve"> PAGEREF _Toc223961409 \h </w:instrText>
+          <w:instrText xml:space="preserve"> PAGEREF _Toc225722877 \h </w:instrText>
         </w:r>
         <w:r>
           <w:rPr>
@@ -2523,7 +2523,7 @@
           <w14:ligatures w14:val="standardContextual"/>
         </w:rPr>
       </w:pPr>
-      <w:hyperlink w:anchor="_Toc223961410" w:history="1">
+      <w:hyperlink w:anchor="_Toc225722878" w:history="1">
         <w:r>
           <w:rPr>
             <w:rStyle w:val="Hyperlink"/>
@@ -2550,7 +2550,7 @@
             <w:noProof/>
             <w:webHidden/>
           </w:rPr>
-          <w:instrText xml:space="preserve"> PAGEREF _Toc223961410 \h </w:instrText>
+          <w:instrText xml:space="preserve"> PAGEREF _Toc225722878 \h </w:instrText>
         </w:r>
         <w:r>
           <w:rPr>
@@ -2596,7 +2596,7 @@
           <w14:ligatures w14:val="standardContextual"/>
         </w:rPr>
       </w:pPr>
-      <w:hyperlink w:anchor="_Toc223961411" w:history="1">
+      <w:hyperlink w:anchor="_Toc225722879" w:history="1">
         <w:r>
           <w:rPr>
             <w:rStyle w:val="Hyperlink"/>
@@ -2623,7 +2623,7 @@
             <w:noProof/>
             <w:webHidden/>
           </w:rPr>
-          <w:instrText xml:space="preserve"> PAGEREF _Toc223961411 \h </w:instrText>
+          <w:instrText xml:space="preserve"> PAGEREF _Toc225722879 \h </w:instrText>
         </w:r>
         <w:r>
           <w:rPr>
@@ -2669,7 +2669,7 @@
           <w14:ligatures w14:val="standardContextual"/>
         </w:rPr>
       </w:pPr>
-      <w:hyperlink w:anchor="_Toc223961412" w:history="1">
+      <w:hyperlink w:anchor="_Toc225722880" w:history="1">
         <w:r>
           <w:rPr>
             <w:rStyle w:val="Hyperlink"/>
@@ -2696,7 +2696,7 @@
             <w:noProof/>
             <w:webHidden/>
           </w:rPr>
-          <w:instrText xml:space="preserve"> PAGEREF _Toc223961412 \h </w:instrText>
+          <w:instrText xml:space="preserve"> PAGEREF _Toc225722880 \h </w:instrText>
         </w:r>
         <w:r>
           <w:rPr>
@@ -2742,7 +2742,7 @@
           <w14:ligatures w14:val="standardContextual"/>
         </w:rPr>
       </w:pPr>
-      <w:hyperlink w:anchor="_Toc223961413" w:history="1">
+      <w:hyperlink w:anchor="_Toc225722881" w:history="1">
         <w:r>
           <w:rPr>
             <w:rStyle w:val="Hyperlink"/>
@@ -2769,7 +2769,7 @@
             <w:noProof/>
             <w:webHidden/>
           </w:rPr>
-          <w:instrText xml:space="preserve"> PAGEREF _Toc223961413 \h </w:instrText>
+          <w:instrText xml:space="preserve"> PAGEREF _Toc225722881 \h </w:instrText>
         </w:r>
         <w:r>
           <w:rPr>
@@ -2789,7 +2789,7 @@
             <w:noProof/>
             <w:webHidden/>
           </w:rPr>
-          <w:t>30</w:t>
+          <w:t>31</w:t>
         </w:r>
         <w:r>
           <w:rPr>
@@ -2815,7 +2815,7 @@
           <w14:ligatures w14:val="standardContextual"/>
         </w:rPr>
       </w:pPr>
-      <w:hyperlink w:anchor="_Toc223961414" w:history="1">
+      <w:hyperlink w:anchor="_Toc225722882" w:history="1">
         <w:r>
           <w:rPr>
             <w:rStyle w:val="Hyperlink"/>
@@ -2842,7 +2842,7 @@
             <w:noProof/>
             <w:webHidden/>
           </w:rPr>
-          <w:instrText xml:space="preserve"> PAGEREF _Toc223961414 \h </w:instrText>
+          <w:instrText xml:space="preserve"> PAGEREF _Toc225722882 \h </w:instrText>
         </w:r>
         <w:r>
           <w:rPr>
@@ -2862,7 +2862,7 @@
             <w:noProof/>
             <w:webHidden/>
           </w:rPr>
-          <w:t>30</w:t>
+          <w:t>31</w:t>
         </w:r>
         <w:r>
           <w:rPr>
@@ -2889,7 +2889,7 @@
           <w14:ligatures w14:val="standardContextual"/>
         </w:rPr>
       </w:pPr>
-      <w:hyperlink w:anchor="_Toc223961415" w:history="1">
+      <w:hyperlink w:anchor="_Toc225722883" w:history="1">
         <w:r>
           <w:rPr>
             <w:rStyle w:val="Hyperlink"/>
@@ -2917,7 +2917,7 @@
             <w:noProof/>
             <w:lang w:eastAsia="cs-CZ"/>
           </w:rPr>
-          <w:t>Analytické metody</w:t>
+          <w:t>cisteni a filtrace dat</w:t>
         </w:r>
         <w:r>
           <w:rPr>
@@ -2938,7 +2938,7 @@
             <w:noProof/>
             <w:webHidden/>
           </w:rPr>
-          <w:instrText xml:space="preserve"> PAGEREF _Toc223961415 \h </w:instrText>
+          <w:instrText xml:space="preserve"> PAGEREF _Toc225722883 \h </w:instrText>
         </w:r>
         <w:r>
           <w:rPr>
@@ -2958,7 +2958,7 @@
             <w:noProof/>
             <w:webHidden/>
           </w:rPr>
-          <w:t>31</w:t>
+          <w:t>32</w:t>
         </w:r>
         <w:r>
           <w:rPr>
@@ -2985,7 +2985,7 @@
           <w14:ligatures w14:val="standardContextual"/>
         </w:rPr>
       </w:pPr>
-      <w:hyperlink w:anchor="_Toc223961416" w:history="1">
+      <w:hyperlink w:anchor="_Toc225722884" w:history="1">
         <w:r>
           <w:rPr>
             <w:rStyle w:val="Hyperlink"/>
@@ -3013,7 +3013,7 @@
             <w:noProof/>
             <w:lang w:eastAsia="cs-CZ"/>
           </w:rPr>
-          <w:t>Omezení metodologie</w:t>
+          <w:t>Ekonometrické metody</w:t>
         </w:r>
         <w:r>
           <w:rPr>
@@ -3034,7 +3034,7 @@
             <w:noProof/>
             <w:webHidden/>
           </w:rPr>
-          <w:instrText xml:space="preserve"> PAGEREF _Toc223961416 \h </w:instrText>
+          <w:instrText xml:space="preserve"> PAGEREF _Toc225722884 \h </w:instrText>
         </w:r>
         <w:r>
           <w:rPr>
@@ -3081,7 +3081,7 @@
           <w14:ligatures w14:val="standardContextual"/>
         </w:rPr>
       </w:pPr>
-      <w:hyperlink w:anchor="_Toc223961417" w:history="1">
+      <w:hyperlink w:anchor="_Toc225722885" w:history="1">
         <w:r>
           <w:rPr>
             <w:rStyle w:val="Hyperlink"/>
@@ -3089,7 +3089,7 @@
             <w:noProof/>
             <w:lang w:eastAsia="cs-CZ"/>
           </w:rPr>
-          <w:t>5.1</w:t>
+          <w:t>4.6</w:t>
         </w:r>
         <w:r>
           <w:rPr>
@@ -3109,7 +3109,7 @@
             <w:noProof/>
             <w:lang w:eastAsia="cs-CZ"/>
           </w:rPr>
-          <w:t>Přehled datasetu</w:t>
+          <w:t>Diagnostika a omezení metodologie</w:t>
         </w:r>
         <w:r>
           <w:rPr>
@@ -3130,7 +3130,7 @@
             <w:noProof/>
             <w:webHidden/>
           </w:rPr>
-          <w:instrText xml:space="preserve"> PAGEREF _Toc223961417 \h </w:instrText>
+          <w:instrText xml:space="preserve"> PAGEREF _Toc225722885 \h </w:instrText>
         </w:r>
         <w:r>
           <w:rPr>
@@ -3150,7 +3150,7 @@
             <w:noProof/>
             <w:webHidden/>
           </w:rPr>
-          <w:t>34</w:t>
+          <w:t>32</w:t>
         </w:r>
         <w:r>
           <w:rPr>
@@ -3177,7 +3177,7 @@
           <w14:ligatures w14:val="standardContextual"/>
         </w:rPr>
       </w:pPr>
-      <w:hyperlink w:anchor="_Toc223961418" w:history="1">
+      <w:hyperlink w:anchor="_Toc225722886" w:history="1">
         <w:r>
           <w:rPr>
             <w:rStyle w:val="Hyperlink"/>
@@ -3185,7 +3185,7 @@
             <w:noProof/>
             <w:lang w:eastAsia="cs-CZ"/>
           </w:rPr>
-          <w:t>5.2</w:t>
+          <w:t>5.1</w:t>
         </w:r>
         <w:r>
           <w:rPr>
@@ -3205,7 +3205,7 @@
             <w:noProof/>
             <w:lang w:eastAsia="cs-CZ"/>
           </w:rPr>
-          <w:t>Identifikace a kategorizace AI dovedností</w:t>
+          <w:t>Přehled datasetu</w:t>
         </w:r>
         <w:r>
           <w:rPr>
@@ -3226,7 +3226,7 @@
             <w:noProof/>
             <w:webHidden/>
           </w:rPr>
-          <w:instrText xml:space="preserve"> PAGEREF _Toc223961418 \h </w:instrText>
+          <w:instrText xml:space="preserve"> PAGEREF _Toc225722886 \h </w:instrText>
         </w:r>
         <w:r>
           <w:rPr>
@@ -3273,7 +3273,7 @@
           <w14:ligatures w14:val="standardContextual"/>
         </w:rPr>
       </w:pPr>
-      <w:hyperlink w:anchor="_Toc223961419" w:history="1">
+      <w:hyperlink w:anchor="_Toc225722887" w:history="1">
         <w:r>
           <w:rPr>
             <w:rStyle w:val="Hyperlink"/>
@@ -3281,7 +3281,7 @@
             <w:noProof/>
             <w:lang w:eastAsia="cs-CZ"/>
           </w:rPr>
-          <w:t>5.3</w:t>
+          <w:t>5.2</w:t>
         </w:r>
         <w:r>
           <w:rPr>
@@ -3301,7 +3301,7 @@
             <w:noProof/>
             <w:lang w:eastAsia="cs-CZ"/>
           </w:rPr>
-          <w:t>Rozložení AI pozic podle AI tier</w:t>
+          <w:t>Identifikace a kategorizace AI dovedností</w:t>
         </w:r>
         <w:r>
           <w:rPr>
@@ -3322,7 +3322,7 @@
             <w:noProof/>
             <w:webHidden/>
           </w:rPr>
-          <w:instrText xml:space="preserve"> PAGEREF _Toc223961419 \h </w:instrText>
+          <w:instrText xml:space="preserve"> PAGEREF _Toc225722887 \h </w:instrText>
         </w:r>
         <w:r>
           <w:rPr>
@@ -3369,14 +3369,15 @@
           <w14:ligatures w14:val="standardContextual"/>
         </w:rPr>
       </w:pPr>
-      <w:hyperlink w:anchor="_Toc223961420" w:history="1">
+      <w:hyperlink w:anchor="_Toc225722888" w:history="1">
         <w:r>
           <w:rPr>
             <w:rStyle w:val="Hyperlink"/>
+            <w:rFonts w:eastAsia="Times New Roman"/>
             <w:noProof/>
             <w:lang w:eastAsia="cs-CZ"/>
           </w:rPr>
-          <w:t>5.4</w:t>
+          <w:t>5.3</w:t>
         </w:r>
         <w:r>
           <w:rPr>
@@ -3392,10 +3393,11 @@
         <w:r>
           <w:rPr>
             <w:rStyle w:val="Hyperlink"/>
+            <w:rFonts w:eastAsia="Times New Roman"/>
             <w:noProof/>
             <w:lang w:eastAsia="cs-CZ"/>
           </w:rPr>
-          <w:t>Mzdová analýza</w:t>
+          <w:t>Rozložení AI pozic podle AI tier</w:t>
         </w:r>
         <w:r>
           <w:rPr>
@@ -3416,7 +3418,7 @@
             <w:noProof/>
             <w:webHidden/>
           </w:rPr>
-          <w:instrText xml:space="preserve"> PAGEREF _Toc223961420 \h </w:instrText>
+          <w:instrText xml:space="preserve"> PAGEREF _Toc225722888 \h </w:instrText>
         </w:r>
         <w:r>
           <w:rPr>
@@ -3463,14 +3465,14 @@
           <w14:ligatures w14:val="standardContextual"/>
         </w:rPr>
       </w:pPr>
-      <w:hyperlink w:anchor="_Toc223961421" w:history="1">
+      <w:hyperlink w:anchor="_Toc225722889" w:history="1">
         <w:r>
           <w:rPr>
             <w:rStyle w:val="Hyperlink"/>
             <w:noProof/>
-            <w:lang w:val="en-US"/>
-          </w:rPr>
-          <w:t>5.5</w:t>
+            <w:lang w:eastAsia="cs-CZ"/>
+          </w:rPr>
+          <w:t>5.4</w:t>
         </w:r>
         <w:r>
           <w:rPr>
@@ -3487,9 +3489,16 @@
           <w:rPr>
             <w:rStyle w:val="Hyperlink"/>
             <w:noProof/>
-            <w:lang w:val="en-US"/>
-          </w:rPr>
-          <w:t>Determinanty AI klasifikace (logit/multinomiální)</w:t>
+            <w:lang w:eastAsia="cs-CZ"/>
+          </w:rPr>
+          <w:t>Mzdová analýza (</w:t>
+        </w:r>
+        <w:r>
+          <w:rPr>
+            <w:rStyle w:val="Hyperlink"/>
+            <w:noProof/>
+          </w:rPr>
+          <w:t>OLS regrese — AI prémie na platu)</w:t>
         </w:r>
         <w:r>
           <w:rPr>
@@ -3510,7 +3519,7 @@
             <w:noProof/>
             <w:webHidden/>
           </w:rPr>
-          <w:instrText xml:space="preserve"> PAGEREF _Toc223961421 \h </w:instrText>
+          <w:instrText xml:space="preserve"> PAGEREF _Toc225722889 \h </w:instrText>
         </w:r>
         <w:r>
           <w:rPr>
@@ -3557,15 +3566,14 @@
           <w14:ligatures w14:val="standardContextual"/>
         </w:rPr>
       </w:pPr>
-      <w:hyperlink w:anchor="_Toc223961422" w:history="1">
+      <w:hyperlink w:anchor="_Toc225722890" w:history="1">
         <w:r>
           <w:rPr>
             <w:rStyle w:val="Hyperlink"/>
-            <w:rFonts w:eastAsia="Times New Roman"/>
-            <w:noProof/>
-            <w:lang w:eastAsia="cs-CZ"/>
-          </w:rPr>
-          <w:t>5.6</w:t>
+            <w:noProof/>
+            <w:lang w:val="en-US"/>
+          </w:rPr>
+          <w:t>5.5</w:t>
         </w:r>
         <w:r>
           <w:rPr>
@@ -3581,11 +3589,17 @@
         <w:r>
           <w:rPr>
             <w:rStyle w:val="Hyperlink"/>
-            <w:rFonts w:eastAsia="Times New Roman"/>
-            <w:noProof/>
-            <w:lang w:eastAsia="cs-CZ"/>
-          </w:rPr>
-          <w:t>Komplementární dovednosti k AI</w:t>
+            <w:noProof/>
+            <w:lang w:val="en-US"/>
+          </w:rPr>
+          <w:t>Determinanty AI klasifikace (logit/multinomiální) (</w:t>
+        </w:r>
+        <w:r>
+          <w:rPr>
+            <w:rStyle w:val="Hyperlink"/>
+            <w:noProof/>
+          </w:rPr>
+          <w:t>determinanty AI požadavku)</w:t>
         </w:r>
         <w:r>
           <w:rPr>
@@ -3606,7 +3620,7 @@
             <w:noProof/>
             <w:webHidden/>
           </w:rPr>
-          <w:instrText xml:space="preserve"> PAGEREF _Toc223961422 \h </w:instrText>
+          <w:instrText xml:space="preserve"> PAGEREF _Toc225722890 \h </w:instrText>
         </w:r>
         <w:r>
           <w:rPr>
@@ -3653,7 +3667,7 @@
           <w14:ligatures w14:val="standardContextual"/>
         </w:rPr>
       </w:pPr>
-      <w:hyperlink w:anchor="_Toc223961423" w:history="1">
+      <w:hyperlink w:anchor="_Toc225722891" w:history="1">
         <w:r>
           <w:rPr>
             <w:rStyle w:val="Hyperlink"/>
@@ -3661,7 +3675,7 @@
             <w:noProof/>
             <w:lang w:eastAsia="cs-CZ"/>
           </w:rPr>
-          <w:t>5.7</w:t>
+          <w:t>5.6</w:t>
         </w:r>
         <w:r>
           <w:rPr>
@@ -3681,7 +3695,25 @@
             <w:noProof/>
             <w:lang w:eastAsia="cs-CZ"/>
           </w:rPr>
-          <w:t>Vztah mezi AI dovednostmi a dalšími faktory</w:t>
+          <w:t>Komple</w:t>
+        </w:r>
+        <w:r>
+          <w:rPr>
+            <w:rStyle w:val="Hyperlink"/>
+            <w:rFonts w:eastAsia="Times New Roman"/>
+            <w:noProof/>
+            <w:lang w:eastAsia="cs-CZ"/>
+          </w:rPr>
+          <w:t>m</w:t>
+        </w:r>
+        <w:r>
+          <w:rPr>
+            <w:rStyle w:val="Hyperlink"/>
+            <w:rFonts w:eastAsia="Times New Roman"/>
+            <w:noProof/>
+            <w:lang w:eastAsia="cs-CZ"/>
+          </w:rPr>
+          <w:t>entární dovednosti k AI</w:t>
         </w:r>
         <w:r>
           <w:rPr>
@@ -3702,7 +3734,7 @@
             <w:noProof/>
             <w:webHidden/>
           </w:rPr>
-          <w:instrText xml:space="preserve"> PAGEREF _Toc223961423 \h </w:instrText>
+          <w:instrText xml:space="preserve"> PAGEREF _Toc225722891 \h </w:instrText>
         </w:r>
         <w:r>
           <w:rPr>
@@ -3749,7 +3781,7 @@
           <w14:ligatures w14:val="standardContextual"/>
         </w:rPr>
       </w:pPr>
-      <w:hyperlink w:anchor="_Toc223961424" w:history="1">
+      <w:hyperlink w:anchor="_Toc225722892" w:history="1">
         <w:r>
           <w:rPr>
             <w:rStyle w:val="Hyperlink"/>
@@ -3757,7 +3789,7 @@
             <w:noProof/>
             <w:lang w:eastAsia="cs-CZ"/>
           </w:rPr>
-          <w:t>5.8</w:t>
+          <w:t>5.7</w:t>
         </w:r>
         <w:r>
           <w:rPr>
@@ -3777,7 +3809,7 @@
             <w:noProof/>
             <w:lang w:eastAsia="cs-CZ"/>
           </w:rPr>
-          <w:t>Sektor IT analýza?</w:t>
+          <w:t>Vztah mezi AI dovednostmi a dalšími faktory</w:t>
         </w:r>
         <w:r>
           <w:rPr>
@@ -3798,7 +3830,7 @@
             <w:noProof/>
             <w:webHidden/>
           </w:rPr>
-          <w:instrText xml:space="preserve"> PAGEREF _Toc223961424 \h </w:instrText>
+          <w:instrText xml:space="preserve"> PAGEREF _Toc225722892 \h </w:instrText>
         </w:r>
         <w:r>
           <w:rPr>
@@ -3845,7 +3877,7 @@
           <w14:ligatures w14:val="standardContextual"/>
         </w:rPr>
       </w:pPr>
-      <w:hyperlink w:anchor="_Toc223961425" w:history="1">
+      <w:hyperlink w:anchor="_Toc225722893" w:history="1">
         <w:r>
           <w:rPr>
             <w:rStyle w:val="Hyperlink"/>
@@ -3853,7 +3885,7 @@
             <w:noProof/>
             <w:lang w:eastAsia="cs-CZ"/>
           </w:rPr>
-          <w:t>5.9</w:t>
+          <w:t>5.8</w:t>
         </w:r>
         <w:r>
           <w:rPr>
@@ -3873,7 +3905,7 @@
             <w:noProof/>
             <w:lang w:eastAsia="cs-CZ"/>
           </w:rPr>
-          <w:t>Diskuse výsledků</w:t>
+          <w:t>Sektor IT analýza?</w:t>
         </w:r>
         <w:r>
           <w:rPr>
@@ -3894,7 +3926,7 @@
             <w:noProof/>
             <w:webHidden/>
           </w:rPr>
-          <w:instrText xml:space="preserve"> PAGEREF _Toc223961425 \h </w:instrText>
+          <w:instrText xml:space="preserve"> PAGEREF _Toc225722893 \h </w:instrText>
         </w:r>
         <w:r>
           <w:rPr>
@@ -3914,7 +3946,7 @@
             <w:noProof/>
             <w:webHidden/>
           </w:rPr>
-          <w:t>35</w:t>
+          <w:t>34</w:t>
         </w:r>
         <w:r>
           <w:rPr>
@@ -3927,8 +3959,9 @@
     </w:p>
     <w:p>
       <w:pPr>
-        <w:pStyle w:val="TOC3"/>
-        <w:tabs>
+        <w:pStyle w:val="TOC2"/>
+        <w:tabs>
+          <w:tab w:val="left" w:pos="960"/>
           <w:tab w:val="right" w:leader="dot" w:pos="8493"/>
         </w:tabs>
         <w:rPr>
@@ -3940,230 +3973,7 @@
           <w14:ligatures w14:val="standardContextual"/>
         </w:rPr>
       </w:pPr>
-      <w:hyperlink w:anchor="_Toc223961426" w:history="1">
-        <w:r>
-          <w:rPr>
-            <w:rStyle w:val="Hyperlink"/>
-            <w:noProof/>
-            <w:lang w:val="en-US"/>
-          </w:rPr>
-          <w:t>Interpretace výsledků v kontextu literatury</w:t>
-        </w:r>
-        <w:r>
-          <w:rPr>
-            <w:noProof/>
-            <w:webHidden/>
-          </w:rPr>
-          <w:tab/>
-        </w:r>
-        <w:r>
-          <w:rPr>
-            <w:noProof/>
-            <w:webHidden/>
-          </w:rPr>
-          <w:fldChar w:fldCharType="begin"/>
-        </w:r>
-        <w:r>
-          <w:rPr>
-            <w:noProof/>
-            <w:webHidden/>
-          </w:rPr>
-          <w:instrText xml:space="preserve"> PAGEREF _Toc223961426 \h </w:instrText>
-        </w:r>
-        <w:r>
-          <w:rPr>
-            <w:noProof/>
-            <w:webHidden/>
-          </w:rPr>
-        </w:r>
-        <w:r>
-          <w:rPr>
-            <w:noProof/>
-            <w:webHidden/>
-          </w:rPr>
-          <w:fldChar w:fldCharType="separate"/>
-        </w:r>
-        <w:r>
-          <w:rPr>
-            <w:noProof/>
-            <w:webHidden/>
-          </w:rPr>
-          <w:t>35</w:t>
-        </w:r>
-        <w:r>
-          <w:rPr>
-            <w:noProof/>
-            <w:webHidden/>
-          </w:rPr>
-          <w:fldChar w:fldCharType="end"/>
-        </w:r>
-      </w:hyperlink>
-    </w:p>
-    <w:p>
-      <w:pPr>
-        <w:pStyle w:val="TOC3"/>
-        <w:tabs>
-          <w:tab w:val="right" w:leader="dot" w:pos="8493"/>
-        </w:tabs>
-        <w:rPr>
-          <w:rFonts w:eastAsiaTheme="minorEastAsia"/>
-          <w:noProof/>
-          <w:kern w:val="2"/>
-          <w:szCs w:val="24"/>
-          <w:lang w:val="en-US"/>
-          <w14:ligatures w14:val="standardContextual"/>
-        </w:rPr>
-      </w:pPr>
-      <w:hyperlink w:anchor="_Toc223961427" w:history="1">
-        <w:r>
-          <w:rPr>
-            <w:rStyle w:val="Hyperlink"/>
-            <w:noProof/>
-            <w:lang w:val="en-US"/>
-          </w:rPr>
-          <w:t>Srovnání s Bone et al., Engberg et al.</w:t>
-        </w:r>
-        <w:r>
-          <w:rPr>
-            <w:noProof/>
-            <w:webHidden/>
-          </w:rPr>
-          <w:tab/>
-        </w:r>
-        <w:r>
-          <w:rPr>
-            <w:noProof/>
-            <w:webHidden/>
-          </w:rPr>
-          <w:fldChar w:fldCharType="begin"/>
-        </w:r>
-        <w:r>
-          <w:rPr>
-            <w:noProof/>
-            <w:webHidden/>
-          </w:rPr>
-          <w:instrText xml:space="preserve"> PAGEREF _Toc223961427 \h </w:instrText>
-        </w:r>
-        <w:r>
-          <w:rPr>
-            <w:noProof/>
-            <w:webHidden/>
-          </w:rPr>
-        </w:r>
-        <w:r>
-          <w:rPr>
-            <w:noProof/>
-            <w:webHidden/>
-          </w:rPr>
-          <w:fldChar w:fldCharType="separate"/>
-        </w:r>
-        <w:r>
-          <w:rPr>
-            <w:noProof/>
-            <w:webHidden/>
-          </w:rPr>
-          <w:t>35</w:t>
-        </w:r>
-        <w:r>
-          <w:rPr>
-            <w:noProof/>
-            <w:webHidden/>
-          </w:rPr>
-          <w:fldChar w:fldCharType="end"/>
-        </w:r>
-      </w:hyperlink>
-    </w:p>
-    <w:p>
-      <w:pPr>
-        <w:pStyle w:val="TOC3"/>
-        <w:tabs>
-          <w:tab w:val="right" w:leader="dot" w:pos="8493"/>
-        </w:tabs>
-        <w:rPr>
-          <w:rFonts w:eastAsiaTheme="minorEastAsia"/>
-          <w:noProof/>
-          <w:kern w:val="2"/>
-          <w:szCs w:val="24"/>
-          <w:lang w:val="en-US"/>
-          <w14:ligatures w14:val="standardContextual"/>
-        </w:rPr>
-      </w:pPr>
-      <w:hyperlink w:anchor="_Toc223961428" w:history="1">
-        <w:r>
-          <w:rPr>
-            <w:rStyle w:val="Hyperlink"/>
-            <w:noProof/>
-            <w:lang w:val="en-US"/>
-          </w:rPr>
-          <w:t>Implikace pro teorii lidského kapitálu</w:t>
-        </w:r>
-        <w:r>
-          <w:rPr>
-            <w:noProof/>
-            <w:webHidden/>
-          </w:rPr>
-          <w:tab/>
-        </w:r>
-        <w:r>
-          <w:rPr>
-            <w:noProof/>
-            <w:webHidden/>
-          </w:rPr>
-          <w:fldChar w:fldCharType="begin"/>
-        </w:r>
-        <w:r>
-          <w:rPr>
-            <w:noProof/>
-            <w:webHidden/>
-          </w:rPr>
-          <w:instrText xml:space="preserve"> PAGEREF _Toc223961428 \h </w:instrText>
-        </w:r>
-        <w:r>
-          <w:rPr>
-            <w:noProof/>
-            <w:webHidden/>
-          </w:rPr>
-        </w:r>
-        <w:r>
-          <w:rPr>
-            <w:noProof/>
-            <w:webHidden/>
-          </w:rPr>
-          <w:fldChar w:fldCharType="separate"/>
-        </w:r>
-        <w:r>
-          <w:rPr>
-            <w:noProof/>
-            <w:webHidden/>
-          </w:rPr>
-          <w:t>35</w:t>
-        </w:r>
-        <w:r>
-          <w:rPr>
-            <w:noProof/>
-            <w:webHidden/>
-          </w:rPr>
-          <w:fldChar w:fldCharType="end"/>
-        </w:r>
-      </w:hyperlink>
-    </w:p>
-    <w:p>
-      <w:pPr>
-        <w:pStyle w:val="TOC2"/>
-        <w:tabs>
-          <w:tab w:val="left" w:pos="960"/>
-          <w:tab w:val="right" w:leader="dot" w:pos="8493"/>
-        </w:tabs>
-        <w:rPr>
-          <w:rFonts w:eastAsiaTheme="minorEastAsia"/>
-          <w:noProof/>
-          <w:kern w:val="2"/>
-          <w:szCs w:val="24"/>
-          <w:lang w:val="en-US"/>
-          <w14:ligatures w14:val="standardContextual"/>
-        </w:rPr>
-      </w:pPr>
-      <w:hyperlink w:anchor="_Toc223961429" w:history="1">
+      <w:hyperlink w:anchor="_Toc225722894" w:history="1">
         <w:r>
           <w:rPr>
             <w:rStyle w:val="Hyperlink"/>
@@ -4171,7 +3981,7 @@
             <w:noProof/>
             <w:lang w:eastAsia="cs-CZ"/>
           </w:rPr>
-          <w:t>6.1</w:t>
+          <w:t>5.9</w:t>
         </w:r>
         <w:r>
           <w:rPr>
@@ -4191,7 +4001,7 @@
             <w:noProof/>
             <w:lang w:eastAsia="cs-CZ"/>
           </w:rPr>
-          <w:t>Shrnutí hlavních zjištění</w:t>
+          <w:t>Diskuse výsledků a limitace</w:t>
         </w:r>
         <w:r>
           <w:rPr>
@@ -4212,7 +4022,7 @@
             <w:noProof/>
             <w:webHidden/>
           </w:rPr>
-          <w:instrText xml:space="preserve"> PAGEREF _Toc223961429 \h </w:instrText>
+          <w:instrText xml:space="preserve"> PAGEREF _Toc225722894 \h </w:instrText>
         </w:r>
         <w:r>
           <w:rPr>
@@ -4232,7 +4042,229 @@
             <w:noProof/>
             <w:webHidden/>
           </w:rPr>
-          <w:t>36</w:t>
+          <w:t>35</w:t>
+        </w:r>
+        <w:r>
+          <w:rPr>
+            <w:noProof/>
+            <w:webHidden/>
+          </w:rPr>
+          <w:fldChar w:fldCharType="end"/>
+        </w:r>
+      </w:hyperlink>
+    </w:p>
+    <w:p>
+      <w:pPr>
+        <w:pStyle w:val="TOC3"/>
+        <w:tabs>
+          <w:tab w:val="right" w:leader="dot" w:pos="8493"/>
+        </w:tabs>
+        <w:rPr>
+          <w:rFonts w:eastAsiaTheme="minorEastAsia"/>
+          <w:noProof/>
+          <w:kern w:val="2"/>
+          <w:szCs w:val="24"/>
+          <w:lang w:val="en-US"/>
+          <w14:ligatures w14:val="standardContextual"/>
+        </w:rPr>
+      </w:pPr>
+      <w:hyperlink w:anchor="_Toc225722895" w:history="1">
+        <w:r>
+          <w:rPr>
+            <w:rStyle w:val="Hyperlink"/>
+            <w:noProof/>
+            <w:lang w:val="en-US"/>
+          </w:rPr>
+          <w:t>Interpretace výsledků v kontextu literatury</w:t>
+        </w:r>
+        <w:r>
+          <w:rPr>
+            <w:noProof/>
+            <w:webHidden/>
+          </w:rPr>
+          <w:tab/>
+        </w:r>
+        <w:r>
+          <w:rPr>
+            <w:noProof/>
+            <w:webHidden/>
+          </w:rPr>
+          <w:fldChar w:fldCharType="begin"/>
+        </w:r>
+        <w:r>
+          <w:rPr>
+            <w:noProof/>
+            <w:webHidden/>
+          </w:rPr>
+          <w:instrText xml:space="preserve"> PAGEREF _Toc225722895 \h </w:instrText>
+        </w:r>
+        <w:r>
+          <w:rPr>
+            <w:noProof/>
+            <w:webHidden/>
+          </w:rPr>
+        </w:r>
+        <w:r>
+          <w:rPr>
+            <w:noProof/>
+            <w:webHidden/>
+          </w:rPr>
+          <w:fldChar w:fldCharType="separate"/>
+        </w:r>
+        <w:r>
+          <w:rPr>
+            <w:noProof/>
+            <w:webHidden/>
+          </w:rPr>
+          <w:t>35</w:t>
+        </w:r>
+        <w:r>
+          <w:rPr>
+            <w:noProof/>
+            <w:webHidden/>
+          </w:rPr>
+          <w:fldChar w:fldCharType="end"/>
+        </w:r>
+      </w:hyperlink>
+    </w:p>
+    <w:p>
+      <w:pPr>
+        <w:pStyle w:val="TOC3"/>
+        <w:tabs>
+          <w:tab w:val="right" w:leader="dot" w:pos="8493"/>
+        </w:tabs>
+        <w:rPr>
+          <w:rFonts w:eastAsiaTheme="minorEastAsia"/>
+          <w:noProof/>
+          <w:kern w:val="2"/>
+          <w:szCs w:val="24"/>
+          <w:lang w:val="en-US"/>
+          <w14:ligatures w14:val="standardContextual"/>
+        </w:rPr>
+      </w:pPr>
+      <w:hyperlink w:anchor="_Toc225722896" w:history="1">
+        <w:r>
+          <w:rPr>
+            <w:rStyle w:val="Hyperlink"/>
+            <w:noProof/>
+            <w:lang w:val="en-US"/>
+          </w:rPr>
+          <w:t>Srovnání s Bone et al., Engberg et al.</w:t>
+        </w:r>
+        <w:r>
+          <w:rPr>
+            <w:noProof/>
+            <w:webHidden/>
+          </w:rPr>
+          <w:tab/>
+        </w:r>
+        <w:r>
+          <w:rPr>
+            <w:noProof/>
+            <w:webHidden/>
+          </w:rPr>
+          <w:fldChar w:fldCharType="begin"/>
+        </w:r>
+        <w:r>
+          <w:rPr>
+            <w:noProof/>
+            <w:webHidden/>
+          </w:rPr>
+          <w:instrText xml:space="preserve"> PAGEREF _Toc225722896 \h </w:instrText>
+        </w:r>
+        <w:r>
+          <w:rPr>
+            <w:noProof/>
+            <w:webHidden/>
+          </w:rPr>
+        </w:r>
+        <w:r>
+          <w:rPr>
+            <w:noProof/>
+            <w:webHidden/>
+          </w:rPr>
+          <w:fldChar w:fldCharType="separate"/>
+        </w:r>
+        <w:r>
+          <w:rPr>
+            <w:noProof/>
+            <w:webHidden/>
+          </w:rPr>
+          <w:t>35</w:t>
+        </w:r>
+        <w:r>
+          <w:rPr>
+            <w:noProof/>
+            <w:webHidden/>
+          </w:rPr>
+          <w:fldChar w:fldCharType="end"/>
+        </w:r>
+      </w:hyperlink>
+    </w:p>
+    <w:p>
+      <w:pPr>
+        <w:pStyle w:val="TOC3"/>
+        <w:tabs>
+          <w:tab w:val="right" w:leader="dot" w:pos="8493"/>
+        </w:tabs>
+        <w:rPr>
+          <w:rFonts w:eastAsiaTheme="minorEastAsia"/>
+          <w:noProof/>
+          <w:kern w:val="2"/>
+          <w:szCs w:val="24"/>
+          <w:lang w:val="en-US"/>
+          <w14:ligatures w14:val="standardContextual"/>
+        </w:rPr>
+      </w:pPr>
+      <w:hyperlink w:anchor="_Toc225722897" w:history="1">
+        <w:r>
+          <w:rPr>
+            <w:rStyle w:val="Hyperlink"/>
+            <w:noProof/>
+            <w:lang w:val="en-US"/>
+          </w:rPr>
+          <w:t>Implikace pro teorii lidského kapitálu</w:t>
+        </w:r>
+        <w:r>
+          <w:rPr>
+            <w:noProof/>
+            <w:webHidden/>
+          </w:rPr>
+          <w:tab/>
+        </w:r>
+        <w:r>
+          <w:rPr>
+            <w:noProof/>
+            <w:webHidden/>
+          </w:rPr>
+          <w:fldChar w:fldCharType="begin"/>
+        </w:r>
+        <w:r>
+          <w:rPr>
+            <w:noProof/>
+            <w:webHidden/>
+          </w:rPr>
+          <w:instrText xml:space="preserve"> PAGEREF _Toc225722897 \h </w:instrText>
+        </w:r>
+        <w:r>
+          <w:rPr>
+            <w:noProof/>
+            <w:webHidden/>
+          </w:rPr>
+        </w:r>
+        <w:r>
+          <w:rPr>
+            <w:noProof/>
+            <w:webHidden/>
+          </w:rPr>
+          <w:fldChar w:fldCharType="separate"/>
+        </w:r>
+        <w:r>
+          <w:rPr>
+            <w:noProof/>
+            <w:webHidden/>
+          </w:rPr>
+          <w:t>35</w:t>
         </w:r>
         <w:r>
           <w:rPr>
@@ -4259,7 +4291,7 @@
           <w14:ligatures w14:val="standardContextual"/>
         </w:rPr>
       </w:pPr>
-      <w:hyperlink w:anchor="_Toc223961430" w:history="1">
+      <w:hyperlink w:anchor="_Toc225722898" w:history="1">
         <w:r>
           <w:rPr>
             <w:rStyle w:val="Hyperlink"/>
@@ -4267,7 +4299,7 @@
             <w:noProof/>
             <w:lang w:eastAsia="cs-CZ"/>
           </w:rPr>
-          <w:t>6.2</w:t>
+          <w:t>6.1</w:t>
         </w:r>
         <w:r>
           <w:rPr>
@@ -4287,7 +4319,7 @@
             <w:noProof/>
             <w:lang w:eastAsia="cs-CZ"/>
           </w:rPr>
-          <w:t>Teoretické implikace</w:t>
+          <w:t>Shrnutí hlavních zjištění</w:t>
         </w:r>
         <w:r>
           <w:rPr>
@@ -4308,7 +4340,7 @@
             <w:noProof/>
             <w:webHidden/>
           </w:rPr>
-          <w:instrText xml:space="preserve"> PAGEREF _Toc223961430 \h </w:instrText>
+          <w:instrText xml:space="preserve"> PAGEREF _Toc225722898 \h </w:instrText>
         </w:r>
         <w:r>
           <w:rPr>
@@ -4355,7 +4387,7 @@
           <w14:ligatures w14:val="standardContextual"/>
         </w:rPr>
       </w:pPr>
-      <w:hyperlink w:anchor="_Toc223961431" w:history="1">
+      <w:hyperlink w:anchor="_Toc225722899" w:history="1">
         <w:r>
           <w:rPr>
             <w:rStyle w:val="Hyperlink"/>
@@ -4363,7 +4395,7 @@
             <w:noProof/>
             <w:lang w:eastAsia="cs-CZ"/>
           </w:rPr>
-          <w:t>6.3</w:t>
+          <w:t>6.2</w:t>
         </w:r>
         <w:r>
           <w:rPr>
@@ -4383,7 +4415,7 @@
             <w:noProof/>
             <w:lang w:eastAsia="cs-CZ"/>
           </w:rPr>
-          <w:t>Praktické implikace</w:t>
+          <w:t>Teoretické implikace</w:t>
         </w:r>
         <w:r>
           <w:rPr>
@@ -4404,7 +4436,7 @@
             <w:noProof/>
             <w:webHidden/>
           </w:rPr>
-          <w:instrText xml:space="preserve"> PAGEREF _Toc223961431 \h </w:instrText>
+          <w:instrText xml:space="preserve"> PAGEREF _Toc225722899 \h </w:instrText>
         </w:r>
         <w:r>
           <w:rPr>
@@ -4451,7 +4483,7 @@
           <w14:ligatures w14:val="standardContextual"/>
         </w:rPr>
       </w:pPr>
-      <w:hyperlink w:anchor="_Toc223961432" w:history="1">
+      <w:hyperlink w:anchor="_Toc225722900" w:history="1">
         <w:r>
           <w:rPr>
             <w:rStyle w:val="Hyperlink"/>
@@ -4459,7 +4491,7 @@
             <w:noProof/>
             <w:lang w:eastAsia="cs-CZ"/>
           </w:rPr>
-          <w:t>6.4</w:t>
+          <w:t>6.3</w:t>
         </w:r>
         <w:r>
           <w:rPr>
@@ -4479,7 +4511,7 @@
             <w:noProof/>
             <w:lang w:eastAsia="cs-CZ"/>
           </w:rPr>
-          <w:t>Náměty pro budoucí výzkum</w:t>
+          <w:t>Praktické implikace</w:t>
         </w:r>
         <w:r>
           <w:rPr>
@@ -4500,7 +4532,7 @@
             <w:noProof/>
             <w:webHidden/>
           </w:rPr>
-          <w:instrText xml:space="preserve"> PAGEREF _Toc223961432 \h </w:instrText>
+          <w:instrText xml:space="preserve"> PAGEREF _Toc225722900 \h </w:instrText>
         </w:r>
         <w:r>
           <w:rPr>
@@ -4547,13 +4579,15 @@
           <w14:ligatures w14:val="standardContextual"/>
         </w:rPr>
       </w:pPr>
-      <w:hyperlink w:anchor="_Toc223961433" w:history="1">
+      <w:hyperlink w:anchor="_Toc225722901" w:history="1">
         <w:r>
           <w:rPr>
             <w:rStyle w:val="Hyperlink"/>
-            <w:noProof/>
-          </w:rPr>
-          <w:t>7.1</w:t>
+            <w:rFonts w:eastAsia="Times New Roman"/>
+            <w:noProof/>
+            <w:lang w:eastAsia="cs-CZ"/>
+          </w:rPr>
+          <w:t>6.4</w:t>
         </w:r>
         <w:r>
           <w:rPr>
@@ -4569,9 +4603,11 @@
         <w:r>
           <w:rPr>
             <w:rStyle w:val="Hyperlink"/>
-            <w:noProof/>
-          </w:rPr>
-          <w:t>Nadpis 2</w:t>
+            <w:rFonts w:eastAsia="Times New Roman"/>
+            <w:noProof/>
+            <w:lang w:eastAsia="cs-CZ"/>
+          </w:rPr>
+          <w:t>Náměty pro budoucí výzkum</w:t>
         </w:r>
         <w:r>
           <w:rPr>
@@ -4592,7 +4628,7 @@
             <w:noProof/>
             <w:webHidden/>
           </w:rPr>
-          <w:instrText xml:space="preserve"> PAGEREF _Toc223961433 \h </w:instrText>
+          <w:instrText xml:space="preserve"> PAGEREF _Toc225722901 \h </w:instrText>
         </w:r>
         <w:r>
           <w:rPr>
@@ -4612,7 +4648,7 @@
             <w:noProof/>
             <w:webHidden/>
           </w:rPr>
-          <w:t>37</w:t>
+          <w:t>36</w:t>
         </w:r>
         <w:r>
           <w:rPr>
@@ -4625,9 +4661,9 @@
     </w:p>
     <w:p>
       <w:pPr>
-        <w:pStyle w:val="TOC3"/>
-        <w:tabs>
-          <w:tab w:val="left" w:pos="1440"/>
+        <w:pStyle w:val="TOC2"/>
+        <w:tabs>
+          <w:tab w:val="left" w:pos="960"/>
           <w:tab w:val="right" w:leader="dot" w:pos="8493"/>
         </w:tabs>
         <w:rPr>
@@ -4639,13 +4675,13 @@
           <w14:ligatures w14:val="standardContextual"/>
         </w:rPr>
       </w:pPr>
-      <w:hyperlink w:anchor="_Toc223961434" w:history="1">
+      <w:hyperlink w:anchor="_Toc225722902" w:history="1">
         <w:r>
           <w:rPr>
             <w:rStyle w:val="Hyperlink"/>
             <w:noProof/>
           </w:rPr>
-          <w:t>7.1.1</w:t>
+          <w:t>7.1</w:t>
         </w:r>
         <w:r>
           <w:rPr>
@@ -4663,6 +4699,98 @@
             <w:rStyle w:val="Hyperlink"/>
             <w:noProof/>
           </w:rPr>
+          <w:t>Nadpis 2</w:t>
+        </w:r>
+        <w:r>
+          <w:rPr>
+            <w:noProof/>
+            <w:webHidden/>
+          </w:rPr>
+          <w:tab/>
+        </w:r>
+        <w:r>
+          <w:rPr>
+            <w:noProof/>
+            <w:webHidden/>
+          </w:rPr>
+          <w:fldChar w:fldCharType="begin"/>
+        </w:r>
+        <w:r>
+          <w:rPr>
+            <w:noProof/>
+            <w:webHidden/>
+          </w:rPr>
+          <w:instrText xml:space="preserve"> PAGEREF _Toc225722902 \h </w:instrText>
+        </w:r>
+        <w:r>
+          <w:rPr>
+            <w:noProof/>
+            <w:webHidden/>
+          </w:rPr>
+        </w:r>
+        <w:r>
+          <w:rPr>
+            <w:noProof/>
+            <w:webHidden/>
+          </w:rPr>
+          <w:fldChar w:fldCharType="separate"/>
+        </w:r>
+        <w:r>
+          <w:rPr>
+            <w:noProof/>
+            <w:webHidden/>
+          </w:rPr>
+          <w:t>37</w:t>
+        </w:r>
+        <w:r>
+          <w:rPr>
+            <w:noProof/>
+            <w:webHidden/>
+          </w:rPr>
+          <w:fldChar w:fldCharType="end"/>
+        </w:r>
+      </w:hyperlink>
+    </w:p>
+    <w:p>
+      <w:pPr>
+        <w:pStyle w:val="TOC3"/>
+        <w:tabs>
+          <w:tab w:val="left" w:pos="1440"/>
+          <w:tab w:val="right" w:leader="dot" w:pos="8493"/>
+        </w:tabs>
+        <w:rPr>
+          <w:rFonts w:eastAsiaTheme="minorEastAsia"/>
+          <w:noProof/>
+          <w:kern w:val="2"/>
+          <w:szCs w:val="24"/>
+          <w:lang w:val="en-US"/>
+          <w14:ligatures w14:val="standardContextual"/>
+        </w:rPr>
+      </w:pPr>
+      <w:hyperlink w:anchor="_Toc225722903" w:history="1">
+        <w:r>
+          <w:rPr>
+            <w:rStyle w:val="Hyperlink"/>
+            <w:noProof/>
+          </w:rPr>
+          <w:t>7.1.1</w:t>
+        </w:r>
+        <w:r>
+          <w:rPr>
+            <w:rFonts w:eastAsiaTheme="minorEastAsia"/>
+            <w:noProof/>
+            <w:kern w:val="2"/>
+            <w:szCs w:val="24"/>
+            <w:lang w:val="en-US"/>
+            <w14:ligatures w14:val="standardContextual"/>
+          </w:rPr>
+          <w:tab/>
+        </w:r>
+        <w:r>
+          <w:rPr>
+            <w:rStyle w:val="Hyperlink"/>
+            <w:noProof/>
+          </w:rPr>
           <w:t>Nadpis 3</w:t>
         </w:r>
         <w:r>
@@ -4684,7 +4812,7 @@
             <w:noProof/>
             <w:webHidden/>
           </w:rPr>
-          <w:instrText xml:space="preserve"> PAGEREF _Toc223961434 \h </w:instrText>
+          <w:instrText xml:space="preserve"> PAGEREF _Toc225722903 \h </w:instrText>
         </w:r>
         <w:r>
           <w:rPr>
@@ -4848,7 +4976,7 @@
           <w:noProof/>
         </w:rPr>
       </w:pPr>
-      <w:bookmarkStart w:id="2" w:name="_Toc223961388"/>
+      <w:bookmarkStart w:id="2" w:name="_Toc225722856"/>
       <w:r>
         <w:rPr>
           <w:noProof/>
@@ -5512,7 +5640,7 @@
         </w:rPr>
       </w:pPr>
       <w:bookmarkStart w:id="5" w:name="_Toc218851985"/>
-      <w:bookmarkStart w:id="6" w:name="_Toc223961389"/>
+      <w:bookmarkStart w:id="6" w:name="_Toc225722857"/>
       <w:r>
         <w:rPr>
           <w:rFonts w:eastAsia="Times New Roman"/>
@@ -6056,7 +6184,7 @@
         </w:rPr>
       </w:pPr>
       <w:bookmarkStart w:id="8" w:name="_Toc218851986"/>
-      <w:bookmarkStart w:id="9" w:name="_Toc223961390"/>
+      <w:bookmarkStart w:id="9" w:name="_Toc225722858"/>
       <w:r>
         <w:rPr>
           <w:rFonts w:eastAsia="Times New Roman"/>
@@ -6113,7 +6241,7 @@
         </w:rPr>
       </w:pPr>
       <w:bookmarkStart w:id="10" w:name="_Toc218851987"/>
-      <w:bookmarkStart w:id="11" w:name="_Toc223961391"/>
+      <w:bookmarkStart w:id="11" w:name="_Toc225722859"/>
       <w:r>
         <w:rPr>
           <w:noProof/>
@@ -6499,7 +6627,7 @@
         </w:rPr>
       </w:pPr>
       <w:bookmarkStart w:id="13" w:name="_Toc218851989"/>
-      <w:bookmarkStart w:id="14" w:name="_Toc223961392"/>
+      <w:bookmarkStart w:id="14" w:name="_Toc225722860"/>
       <w:r>
         <w:rPr>
           <w:rFonts w:eastAsia="Times New Roman"/>
@@ -7721,7 +7849,7 @@
         </w:rPr>
       </w:pPr>
       <w:bookmarkStart w:id="16" w:name="_Toc218851990"/>
-      <w:bookmarkStart w:id="17" w:name="_Toc223961393"/>
+      <w:bookmarkStart w:id="17" w:name="_Toc225722861"/>
       <w:r>
         <w:rPr>
           <w:rFonts w:eastAsia="Times New Roman"/>
@@ -8408,7 +8536,7 @@
           <w:lang w:eastAsia="cs-CZ"/>
         </w:rPr>
       </w:pPr>
-      <w:bookmarkStart w:id="22" w:name="_Toc223961394"/>
+      <w:bookmarkStart w:id="22" w:name="_Toc225722862"/>
       <w:r>
         <w:rPr>
           <w:rFonts w:eastAsia="Times New Roman"/>
@@ -10513,7 +10641,7 @@
         </w:rPr>
       </w:pPr>
       <w:bookmarkStart w:id="39" w:name="_Toc218851992"/>
-      <w:bookmarkStart w:id="40" w:name="_Toc223961395"/>
+      <w:bookmarkStart w:id="40" w:name="_Toc225722863"/>
       <w:r>
         <w:rPr>
           <w:rFonts w:eastAsia="Times New Roman"/>
@@ -11014,7 +11142,7 @@
         </w:rPr>
       </w:pPr>
       <w:bookmarkStart w:id="42" w:name="_Toc218851994"/>
-      <w:bookmarkStart w:id="43" w:name="_Toc223961396"/>
+      <w:bookmarkStart w:id="43" w:name="_Toc225722864"/>
       <w:r>
         <w:rPr>
           <w:rFonts w:eastAsia="Times New Roman"/>
@@ -11047,8 +11175,8 @@
           <w:lang w:eastAsia="cs-CZ"/>
         </w:rPr>
       </w:pPr>
-      <w:bookmarkStart w:id="44" w:name="_Toc223961397"/>
-      <w:bookmarkStart w:id="45" w:name="_Toc218851982"/>
+      <w:bookmarkStart w:id="44" w:name="_Toc218851982"/>
+      <w:bookmarkStart w:id="45" w:name="_Toc225722865"/>
       <w:r>
         <w:rPr>
           <w:rFonts w:eastAsia="Times New Roman"/>
@@ -11066,19 +11194,19 @@
         </w:rPr>
         <w:t>rapidní rozvoj</w:t>
       </w:r>
+      <w:bookmarkEnd w:id="45"/>
+    </w:p>
+    <w:p>
+      <w:pPr>
+        <w:spacing w:before="100" w:beforeAutospacing="1" w:after="100" w:afterAutospacing="1"/>
+        <w:rPr>
+          <w:rFonts w:ascii="Times New Roman" w:eastAsia="Times New Roman" w:hAnsi="Times New Roman" w:cs="Times New Roman"/>
+          <w:noProof/>
+          <w:lang w:eastAsia="cs-CZ"/>
+        </w:rPr>
+      </w:pPr>
+      <w:bookmarkStart w:id="46" w:name="_Hlk222993497"/>
       <w:bookmarkEnd w:id="44"/>
-    </w:p>
-    <w:p>
-      <w:pPr>
-        <w:spacing w:before="100" w:beforeAutospacing="1" w:after="100" w:afterAutospacing="1"/>
-        <w:rPr>
-          <w:rFonts w:ascii="Times New Roman" w:eastAsia="Times New Roman" w:hAnsi="Times New Roman" w:cs="Times New Roman"/>
-          <w:noProof/>
-          <w:lang w:eastAsia="cs-CZ"/>
-        </w:rPr>
-      </w:pPr>
-      <w:bookmarkStart w:id="46" w:name="_Hlk222993497"/>
-      <w:bookmarkEnd w:id="45"/>
       <w:r>
         <w:rPr>
           <w:rFonts w:ascii="Times New Roman" w:eastAsia="Times New Roman" w:hAnsi="Times New Roman" w:cs="Times New Roman"/>
@@ -11407,7 +11535,7 @@
           <w:lang w:eastAsia="cs-CZ"/>
         </w:rPr>
       </w:pPr>
-      <w:bookmarkStart w:id="48" w:name="_Toc223961398"/>
+      <w:bookmarkStart w:id="48" w:name="_Toc225722866"/>
       <w:bookmarkEnd w:id="47"/>
       <w:r>
         <w:rPr>
@@ -11628,7 +11756,7 @@
         </w:rPr>
       </w:pPr>
       <w:bookmarkStart w:id="49" w:name="_Toc218851995"/>
-      <w:bookmarkStart w:id="50" w:name="_Toc223961399"/>
+      <w:bookmarkStart w:id="50" w:name="_Toc225722867"/>
       <w:r>
         <w:rPr>
           <w:rFonts w:eastAsia="Times New Roman"/>
@@ -11650,7 +11778,7 @@
           <w:lang w:eastAsia="cs-CZ"/>
         </w:rPr>
       </w:pPr>
-      <w:bookmarkStart w:id="51" w:name="_Toc223961400"/>
+      <w:bookmarkStart w:id="51" w:name="_Toc225722868"/>
       <w:r>
         <w:rPr>
           <w:rFonts w:eastAsia="Times New Roman"/>
@@ -11999,7 +12127,7 @@
         </w:rPr>
       </w:pPr>
       <w:bookmarkStart w:id="53" w:name="_Toc218851996"/>
-      <w:bookmarkStart w:id="54" w:name="_Toc223961401"/>
+      <w:bookmarkStart w:id="54" w:name="_Toc225722869"/>
       <w:r>
         <w:rPr>
           <w:rFonts w:eastAsia="Times New Roman"/>
@@ -13143,7 +13271,7 @@
         </w:rPr>
       </w:pPr>
       <w:bookmarkStart w:id="55" w:name="_Toc218851997"/>
-      <w:bookmarkStart w:id="56" w:name="_Toc223961402"/>
+      <w:bookmarkStart w:id="56" w:name="_Toc225722870"/>
       <w:r>
         <w:rPr>
           <w:rFonts w:eastAsia="Times New Roman"/>
@@ -13722,7 +13850,7 @@
         </w:rPr>
       </w:pPr>
       <w:bookmarkStart w:id="57" w:name="_Toc218851998"/>
-      <w:bookmarkStart w:id="58" w:name="_Toc223961403"/>
+      <w:bookmarkStart w:id="58" w:name="_Toc225722871"/>
       <w:r>
         <w:rPr>
           <w:rFonts w:eastAsia="Times New Roman"/>
@@ -13810,7 +13938,7 @@
         </w:rPr>
       </w:pPr>
       <w:bookmarkStart w:id="59" w:name="_Toc218851999"/>
-      <w:bookmarkStart w:id="60" w:name="_Toc223961404"/>
+      <w:bookmarkStart w:id="60" w:name="_Toc225722872"/>
       <w:r>
         <w:rPr>
           <w:rFonts w:eastAsia="Times New Roman"/>
@@ -13878,7 +14006,7 @@
         </w:rPr>
       </w:pPr>
       <w:bookmarkStart w:id="61" w:name="_Toc218852000"/>
-      <w:bookmarkStart w:id="62" w:name="_Toc223961405"/>
+      <w:bookmarkStart w:id="62" w:name="_Toc225722873"/>
       <w:r>
         <w:rPr>
           <w:rFonts w:eastAsia="Times New Roman"/>
@@ -13973,7 +14101,7 @@
         </w:rPr>
       </w:pPr>
       <w:bookmarkStart w:id="63" w:name="_Toc218852001"/>
-      <w:bookmarkStart w:id="64" w:name="_Toc223961406"/>
+      <w:bookmarkStart w:id="64" w:name="_Toc225722874"/>
       <w:r>
         <w:rPr>
           <w:rFonts w:eastAsia="Times New Roman"/>
@@ -14036,16 +14164,14 @@
           <w:noProof/>
         </w:rPr>
       </w:pPr>
-      <w:bookmarkStart w:id="66" w:name="_Toc218852003"/>
-      <w:bookmarkStart w:id="67" w:name="_Toc223961407"/>
-      <w:r>
-        <w:rPr>
-          <w:noProof/>
-        </w:rPr>
-        <w:t>Datové zdroje</w:t>
+      <w:bookmarkStart w:id="66" w:name="_Toc225722875"/>
+      <w:r>
+        <w:rPr>
+          <w:noProof/>
+        </w:rPr>
+        <w:t>Zdroj dat</w:t>
       </w:r>
       <w:bookmarkEnd w:id="66"/>
-      <w:bookmarkEnd w:id="67"/>
     </w:p>
     <w:p>
       <w:pPr>
@@ -14284,7 +14410,49 @@
           <w:noProof/>
           <w:lang w:eastAsia="cs-CZ"/>
         </w:rPr>
-        <w:t>Data byla konkrétně stažena přímo z dostupného kódu přes prohlížeč na Glassdor stránkách a převedena do formátu csv pro lepší práci a zobrazení. Jelikož Glassdoor nepovoluje a není možnost stáhnutí inzerátů pro celý sektor, i když takto lze mezi inzeráty filtrovat, staženy byly inzeráty následujících 35 pozic, které byly vyhodnoceny autorem a vylepšeny pomocí AI jako klíčové a stěžejní v IT sektoru:</w:t>
+        <w:t>Data byla konkrétně stažena přímo z dostupného kódu přes prohlížeč na Glassd</w:t>
+      </w:r>
+      <w:r>
+        <w:rPr>
+          <w:noProof/>
+          <w:lang w:eastAsia="cs-CZ"/>
+        </w:rPr>
+        <w:t>o</w:t>
+      </w:r>
+      <w:r>
+        <w:rPr>
+          <w:noProof/>
+          <w:lang w:eastAsia="cs-CZ"/>
+        </w:rPr>
+        <w:t xml:space="preserve">or stránkách a převedena do formátu csv pro lepší práci a zobrazení. Jelikož Glassdoor nepovoluje a není možnost stáhnutí inzerátů pro celý sektor, i když takto lze mezi inzeráty filtrovat, staženy byly inzeráty následujících 35 pozic, které byly vyhodnoceny </w:t>
+      </w:r>
+      <w:r>
+        <w:rPr>
+          <w:noProof/>
+          <w:lang w:eastAsia="cs-CZ"/>
+        </w:rPr>
+        <w:t xml:space="preserve">profesní znalostí </w:t>
+      </w:r>
+      <w:r>
+        <w:rPr>
+          <w:noProof/>
+          <w:lang w:eastAsia="cs-CZ"/>
+        </w:rPr>
+        <w:t>autor</w:t>
+      </w:r>
+      <w:r>
+        <w:rPr>
+          <w:noProof/>
+          <w:lang w:eastAsia="cs-CZ"/>
+        </w:rPr>
+        <w:t xml:space="preserve">a </w:t>
+      </w:r>
+      <w:r>
+        <w:rPr>
+          <w:noProof/>
+          <w:lang w:eastAsia="cs-CZ"/>
+        </w:rPr>
+        <w:t>a vylepšeny pomocí AI jako klíčové a stěžejní v IT sektoru:</w:t>
       </w:r>
     </w:p>
     <w:p>
@@ -14330,7 +14498,7 @@
         <w:rPr>
           <w:rFonts w:ascii="Times New Roman" w:eastAsia="Times New Roman" w:hAnsi="Times New Roman" w:cs="Times New Roman"/>
           <w:noProof/>
-          <w:lang w:eastAsia="cs-CZ"/>
+          <w:lang w:val="en-US" w:eastAsia="cs-CZ"/>
         </w:rPr>
       </w:pPr>
       <w:r>
@@ -14341,6 +14509,14 @@
         </w:rPr>
         <w:t>Data jsou velmi bohaté a každý inzerát obsahuje název pozice, mzdu, kompletní text inzerátu, požadované dovednosti, vzdělání, lokalitu (stát a město), firemní data jako je velikost firmy, datum jejího založení, jméno CEO, tržby a odvětví a další užitečné informace.</w:t>
       </w:r>
+      <w:r>
+        <w:rPr>
+          <w:rFonts w:ascii="Times New Roman" w:eastAsia="Times New Roman" w:hAnsi="Times New Roman" w:cs="Times New Roman"/>
+          <w:noProof/>
+          <w:lang w:eastAsia="cs-CZ"/>
+        </w:rPr>
+        <w:t xml:space="preserve"> Nevýhodou může být určtý bias k větším firmám a tech hubům.</w:t>
+      </w:r>
     </w:p>
     <w:p>
       <w:pPr>
@@ -14351,18 +14527,26 @@
           <w:lang w:eastAsia="cs-CZ"/>
         </w:rPr>
       </w:pPr>
-      <w:bookmarkStart w:id="68" w:name="_Toc218852004"/>
-      <w:bookmarkStart w:id="69" w:name="_Toc223961408"/>
+      <w:bookmarkStart w:id="67" w:name="_Toc218852004"/>
+      <w:bookmarkStart w:id="68" w:name="_Toc225722876"/>
       <w:r>
         <w:rPr>
           <w:rFonts w:eastAsia="Times New Roman"/>
           <w:noProof/>
           <w:lang w:eastAsia="cs-CZ"/>
         </w:rPr>
-        <w:t>Metodologie klasifikace AI pozic</w:t>
-      </w:r>
+        <w:t>Extrakce dat a</w:t>
+      </w:r>
+      <w:r>
+        <w:rPr>
+          <w:rFonts w:eastAsia="Times New Roman"/>
+          <w:noProof/>
+          <w:lang w:eastAsia="cs-CZ"/>
+        </w:rPr>
+        <w:t xml:space="preserve"> klasifikace AI pozic</w:t>
+      </w:r>
+      <w:bookmarkEnd w:id="67"/>
       <w:bookmarkEnd w:id="68"/>
-      <w:bookmarkEnd w:id="69"/>
     </w:p>
     <w:p>
       <w:pPr>
@@ -14753,7 +14937,19 @@
         <w:rPr>
           <w:noProof/>
         </w:rPr>
-        <w:t>Využita technologie Pattern matching a regulární výrazy.</w:t>
+        <w:t xml:space="preserve">Využita technologie </w:t>
+      </w:r>
+      <w:r>
+        <w:rPr>
+          <w:noProof/>
+        </w:rPr>
+        <w:t>p</w:t>
+      </w:r>
+      <w:r>
+        <w:rPr>
+          <w:noProof/>
+        </w:rPr>
+        <w:t>attern matching a regulární výrazy.</w:t>
       </w:r>
     </w:p>
     <w:p>
@@ -14784,7 +14980,24 @@
           <w:noProof/>
           <w:lang w:eastAsia="cs-CZ"/>
         </w:rPr>
-        <w:t xml:space="preserve">Vyhledávání pomocí klasických textových řetězců 911 předem definovaných termínů technologií vytvořených s asistencí AI pro skenování </w:t>
+        <w:t xml:space="preserve">Vyhledávání pomocí klasických textových řetězců </w:t>
+      </w:r>
+      <w:r>
+        <w:rPr>
+          <w:rFonts w:ascii="Times New Roman" w:eastAsia="Times New Roman" w:hAnsi="Times New Roman" w:cs="Times New Roman"/>
+          <w:noProof/>
+          <w:highlight w:val="yellow"/>
+          <w:lang w:eastAsia="cs-CZ"/>
+        </w:rPr>
+        <w:t>911</w:t>
+      </w:r>
+      <w:r>
+        <w:rPr>
+          <w:rFonts w:ascii="Times New Roman" w:eastAsia="Times New Roman" w:hAnsi="Times New Roman" w:cs="Times New Roman"/>
+          <w:noProof/>
+          <w:lang w:eastAsia="cs-CZ"/>
+        </w:rPr>
+        <w:t xml:space="preserve"> předem definovaných termínů technologií vytvořených s asistencí AI pro skenování </w:t>
       </w:r>
       <w:r>
         <w:rPr>
@@ -14802,6 +15015,30 @@
         </w:rPr>
         <w:t>ze sloupce skills. Z pojetí softwarového inženýrství se jedná o algoritmický průchod hrubého textu v Pythonu (string matching na základě regulárních výrazů). Výsledkem je vždy striktní a stoprocentně předvídatelný seznam nalezených technologií zcela nezávislý na okolním kontextu v inzerátu. Vstup tak zaručuje identický výstup při každém spuštění bez "halucinací".</w:t>
       </w:r>
+      <w:r>
+        <w:rPr>
+          <w:rFonts w:ascii="Times New Roman" w:eastAsia="Times New Roman" w:hAnsi="Times New Roman" w:cs="Times New Roman"/>
+          <w:noProof/>
+          <w:lang w:eastAsia="cs-CZ"/>
+        </w:rPr>
+        <w:t xml:space="preserve"> Slovník také provádí normalizaci, tedy z</w:t>
+      </w:r>
+      <w:r>
+        <w:rPr>
+          <w:rFonts w:ascii="Times New Roman" w:eastAsia="Times New Roman" w:hAnsi="Times New Roman" w:cs="Times New Roman"/>
+          <w:noProof/>
+          <w:lang w:eastAsia="cs-CZ"/>
+        </w:rPr>
+        <w:t xml:space="preserve"> vyskytujících se variant jako například </w:t>
+      </w:r>
+      <w:r>
+        <w:rPr>
+          <w:rFonts w:ascii="Times New Roman" w:eastAsia="Times New Roman" w:hAnsi="Times New Roman" w:cs="Times New Roman"/>
+          <w:noProof/>
+          <w:lang w:eastAsia="cs-CZ"/>
+        </w:rPr>
+        <w:t xml:space="preserve">„Javascript“, „JS“ a „java script“ vytvoří jednotný název dovednosti „javascript“, tak, aby nebyla započtena vícekrát. </w:t>
+      </w:r>
     </w:p>
     <w:p>
       <w:pPr>
@@ -14884,7 +15121,7 @@
           <w:noProof/>
           <w:lang w:eastAsia="cs-CZ"/>
         </w:rPr>
-        <w:t xml:space="preserve">u </w:t>
+        <w:t>u</w:t>
       </w:r>
       <w:r>
         <w:rPr>
@@ -15044,7 +15281,7 @@
           <w:noProof/>
           <w:lang w:eastAsia="cs-CZ"/>
         </w:rPr>
-        <w:t xml:space="preserve"> byla implementována tzv. pojistka. Aby se redukoval fenomén "halucinací" jazykových modelů, byl model instruován k vygenerování tzv. confidence score od 0.0 do 1.0 ke své vlastní klasifikaci tieru. V OLS modelech byly analyticky využity pouze ty inzeráty, kde se úroveň jistoty LLM odhadu pohybovala nad 70 % (v datech jako confidence &gt;= 0.7). To zaručuje vyšší šance na kvalitu, přestože to není neprůstřelná strategie, jelikož si model musí skutečně odůvodnit své řešení a sám se ohodnotit. Ještě </w:t>
+        <w:t xml:space="preserve"> byla implementována tzv. pojistka. Aby se redukoval fenomén "halucinací" jazykových modelů, byl model instruován k vygenerování tzv. confidence score od 0.0 do 1.0 ke své vlastní klasifikaci tieru. V OLS modelech byly analyticky využity pouze ty inzeráty, kde se úroveň jistoty LLM odhadu pohybovala nad 70 % (v datech jako </w:t>
       </w:r>
       <w:r>
         <w:rPr>
@@ -15053,7 +15290,7 @@
           <w:lang w:eastAsia="cs-CZ"/>
         </w:rPr>
         <w:lastRenderedPageBreak/>
-        <w:t>lepší strategií by mohlo být použít další externí model pro validaci, ale pro účely této práce je postup dostačující.</w:t>
+        <w:t>confidence &gt;= 0.7). To zaručuje vyšší šance na kvalitu, přestože to není neprůstřelná strategie, jelikož si model musí skutečně odůvodnit své řešení a sám se ohodnotit. Ještě lepší strategií by mohlo být použít další externí model pro validaci, ale pro účely této práce je postup dostačující.</w:t>
       </w:r>
     </w:p>
     <w:p>
@@ -15091,7 +15328,7 @@
         </w:rPr>
         <w:t xml:space="preserve">Byla také vytvořena v Python projektu pomocná vektorová databáze na technologii ChromaDB jako další vrstva pro lepší výsledky zařazování clusterů. Tato metoda je velmi levná, lokální a pro tento účel bylo zjištěno bohatě postačující, a byla schopna zachytit to, co základní slovníky v Pythonu neobsahovaly. Je zde samozřejmě riziko špatného zařazení, jelikož to se již </w:t>
       </w:r>
-      <w:bookmarkStart w:id="70" w:name="_Hlk222517082"/>
+      <w:bookmarkStart w:id="69" w:name="_Hlk222517082"/>
       <w:r>
         <w:rPr>
           <w:rFonts w:ascii="Times New Roman" w:eastAsia="Times New Roman" w:hAnsi="Times New Roman" w:cs="Times New Roman"/>
@@ -15100,390 +15337,475 @@
         </w:rPr>
         <w:t>nejedná o deterministické třízení s vždy dopředu jasně danýcm předem určeným výsledkem</w:t>
       </w:r>
+      <w:bookmarkEnd w:id="69"/>
+      <w:r>
+        <w:rPr>
+          <w:rFonts w:ascii="Times New Roman" w:eastAsia="Times New Roman" w:hAnsi="Times New Roman" w:cs="Times New Roman"/>
+          <w:noProof/>
+          <w:lang w:eastAsia="cs-CZ"/>
+        </w:rPr>
+        <w:t>. Embeddingy v</w:t>
+      </w:r>
+      <w:r>
+        <w:rPr>
+          <w:rFonts w:ascii="Times New Roman" w:eastAsia="Times New Roman" w:hAnsi="Times New Roman" w:cs="Times New Roman"/>
+          <w:noProof/>
+          <w:lang w:eastAsia="cs-CZ"/>
+        </w:rPr>
+        <w:t> </w:t>
+      </w:r>
+      <w:r>
+        <w:rPr>
+          <w:rFonts w:ascii="Times New Roman" w:eastAsia="Times New Roman" w:hAnsi="Times New Roman" w:cs="Times New Roman"/>
+          <w:noProof/>
+          <w:lang w:eastAsia="cs-CZ"/>
+        </w:rPr>
+        <w:t xml:space="preserve">projektu spojují </w:t>
+      </w:r>
+      <w:r>
+        <w:rPr>
+          <w:rFonts w:ascii="Times New Roman" w:eastAsia="Times New Roman" w:hAnsi="Times New Roman" w:cs="Times New Roman"/>
+          <w:noProof/>
+          <w:lang w:eastAsia="cs-CZ"/>
+        </w:rPr>
+        <w:t xml:space="preserve">hlavně </w:t>
+      </w:r>
+      <w:r>
+        <w:rPr>
+          <w:rFonts w:ascii="Times New Roman" w:eastAsia="Times New Roman" w:hAnsi="Times New Roman" w:cs="Times New Roman"/>
+          <w:noProof/>
+          <w:lang w:eastAsia="cs-CZ"/>
+        </w:rPr>
+        <w:t xml:space="preserve">duplicity (sémantický matching): </w:t>
+      </w:r>
+      <w:r>
+        <w:rPr>
+          <w:rFonts w:ascii="Times New Roman" w:eastAsia="Times New Roman" w:hAnsi="Times New Roman" w:cs="Times New Roman"/>
+          <w:noProof/>
+          <w:lang w:eastAsia="cs-CZ"/>
+        </w:rPr>
+        <w:t>Doplňují tedy dále funkčnost normalizace u slovínků. P</w:t>
+      </w:r>
+      <w:r>
+        <w:rPr>
+          <w:rFonts w:ascii="Times New Roman" w:eastAsia="Times New Roman" w:hAnsi="Times New Roman" w:cs="Times New Roman"/>
+          <w:noProof/>
+          <w:lang w:eastAsia="cs-CZ"/>
+        </w:rPr>
+        <w:t>oznají například, že "Python 3" a "Python" nebo "JS" a "JavaScript" jsou to samé, a ve výsledku to sjednotí</w:t>
+      </w:r>
+      <w:r>
+        <w:rPr>
+          <w:rFonts w:ascii="Times New Roman" w:eastAsia="Times New Roman" w:hAnsi="Times New Roman" w:cs="Times New Roman"/>
+          <w:noProof/>
+          <w:lang w:eastAsia="cs-CZ"/>
+        </w:rPr>
+        <w:t xml:space="preserve"> přestože to nebylo ve slovníku expicitně uvedeno</w:t>
+      </w:r>
+      <w:r>
+        <w:rPr>
+          <w:rFonts w:ascii="Times New Roman" w:eastAsia="Times New Roman" w:hAnsi="Times New Roman" w:cs="Times New Roman"/>
+          <w:noProof/>
+          <w:lang w:eastAsia="cs-CZ"/>
+        </w:rPr>
+        <w:t>. Dále třídí nové věci (auto-kategorizace): Když AI najde novou dovednost, která ještě není ve slovníku, vektory odhadnou podle významu, do jaké skupiny drtivou většinou patří (např. neznámý</w:t>
+      </w:r>
+      <w:r>
+        <w:rPr>
+          <w:rFonts w:ascii="Times New Roman" w:eastAsia="Times New Roman" w:hAnsi="Times New Roman" w:cs="Times New Roman"/>
+          <w:noProof/>
+          <w:lang w:eastAsia="cs-CZ"/>
+        </w:rPr>
+        <w:t xml:space="preserve"> nový</w:t>
+      </w:r>
+      <w:r>
+        <w:rPr>
+          <w:rFonts w:ascii="Times New Roman" w:eastAsia="Times New Roman" w:hAnsi="Times New Roman" w:cs="Times New Roman"/>
+          <w:noProof/>
+          <w:lang w:eastAsia="cs-CZ"/>
+        </w:rPr>
+        <w:t xml:space="preserve"> framework zařadí mezi "frontend").</w:t>
+      </w:r>
+    </w:p>
+    <w:p>
+      <w:pPr>
+        <w:pStyle w:val="Title"/>
+        <w:rPr>
+          <w:rFonts w:eastAsia="Times New Roman"/>
+          <w:noProof/>
+          <w:lang w:eastAsia="cs-CZ"/>
+        </w:rPr>
+      </w:pPr>
+      <w:r>
+        <w:rPr>
+          <w:rFonts w:eastAsia="Times New Roman"/>
+          <w:noProof/>
+          <w:lang w:eastAsia="cs-CZ"/>
+        </w:rPr>
+        <w:t>Bottom-up přístup</w:t>
+      </w:r>
+    </w:p>
+    <w:p>
+      <w:pPr>
+        <w:rPr>
+          <w:noProof/>
+          <w:lang w:eastAsia="cs-CZ"/>
+        </w:rPr>
+      </w:pPr>
+    </w:p>
+    <w:p>
+      <w:pPr>
+        <w:rPr>
+          <w:noProof/>
+          <w:lang w:eastAsia="cs-CZ"/>
+        </w:rPr>
+      </w:pPr>
+      <w:r>
+        <w:rPr>
+          <w:noProof/>
+          <w:lang w:eastAsia="cs-CZ"/>
+        </w:rPr>
+        <w:t xml:space="preserve">Byl použit bottom-up přístup dle Bone at al, kdy pracovní pozice je klasifikována na základě </w:t>
+      </w:r>
+      <w:r>
+        <w:rPr>
+          <w:noProof/>
+          <w:lang w:eastAsia="cs-CZ"/>
+        </w:rPr>
+        <w:t>konkrétních dovedností (skills), které vyžadují, na rozdíl od toho, kdy by byla brána pozice automaticky jako práce s AI dle klasifikace inzerátu podle sektoru nebo odvětví.</w:t>
+      </w:r>
+    </w:p>
+    <w:p>
+      <w:pPr>
+        <w:rPr>
+          <w:noProof/>
+          <w:lang w:eastAsia="cs-CZ"/>
+        </w:rPr>
+      </w:pPr>
+      <w:r>
+        <w:rPr>
+          <w:noProof/>
+          <w:lang w:eastAsia="cs-CZ"/>
+        </w:rPr>
+        <w:t>Při použití tohoto „bottom-up“ přístupu je zaměstnanec AI společnosti považován za pracovníka v oblasti AI pouze tehdy, pokud jeho skutečné pracovní povinnosti zahrnují úkoly spojené s umělou inteligencí, jako je například trénování modelů strojového učení. Tento postup je kladen do protikladu k tzv. „top-down“ přístupu, který hodnotí pozice právě jen podle odvětví (např. automaticky považuje kohokoliv, kdo pracuje pro společnost zabývající se čistou energií, za člověka se „zelenou“ prací, i když jeho úkoly s ekologií nesouvisí).</w:t>
+      </w:r>
+    </w:p>
+    <w:p>
+      <w:pPr>
+        <w:rPr>
+          <w:noProof/>
+          <w:lang w:eastAsia="cs-CZ"/>
+        </w:rPr>
+      </w:pPr>
+      <w:r>
+        <w:rPr>
+          <w:noProof/>
+          <w:lang w:eastAsia="cs-CZ"/>
+        </w:rPr>
+        <w:lastRenderedPageBreak/>
+        <w:t xml:space="preserve">Autoři studie </w:t>
+      </w:r>
+      <w:r>
+        <w:rPr>
+          <w:noProof/>
+          <w:lang w:eastAsia="cs-CZ"/>
+        </w:rPr>
+        <w:t xml:space="preserve">Bone et al </w:t>
+      </w:r>
+      <w:r>
+        <w:rPr>
+          <w:noProof/>
+          <w:lang w:eastAsia="cs-CZ"/>
+        </w:rPr>
+        <w:t>využívají přístup k přesné identifikaci a kategorizaci AI a „zelených“ pracovních míst. V praxi to znamená, že každý pracovní inzerát, který obsahoval alespoň jednu dovednost z oblasti AI, označili jako AI pozici, a inzerát vyžadující alespoň jednu „zelenou“ dovednost kategorizovali jako zelenou pozici, a to bez ohledu na to, v jakém hospodářském sektoru byla pozice inzerována.</w:t>
+      </w:r>
+    </w:p>
+    <w:p>
+      <w:pPr>
+        <w:rPr>
+          <w:rFonts w:eastAsia="Times New Roman"/>
+          <w:noProof/>
+          <w:lang w:eastAsia="cs-CZ"/>
+        </w:rPr>
+      </w:pPr>
+      <w:r>
+        <w:rPr>
+          <w:rFonts w:eastAsia="Times New Roman"/>
+          <w:noProof/>
+          <w:lang w:eastAsia="cs-CZ"/>
+        </w:rPr>
+        <w:t>V této práci se podobně automaticky nepředpokládá</w:t>
+      </w:r>
+      <w:r>
+        <w:rPr>
+          <w:rFonts w:eastAsia="Times New Roman"/>
+          <w:noProof/>
+          <w:lang w:eastAsia="cs-CZ"/>
+        </w:rPr>
+        <w:t>, že pozice s názvem či podobně je skutečně pozice s práci s AI v pravém slova smyslu, ale sleduje</w:t>
+      </w:r>
+      <w:r>
+        <w:rPr>
+          <w:rFonts w:eastAsia="Times New Roman"/>
+          <w:noProof/>
+          <w:lang w:eastAsia="cs-CZ"/>
+        </w:rPr>
+        <w:t xml:space="preserve"> se</w:t>
+      </w:r>
+      <w:r>
+        <w:rPr>
+          <w:rFonts w:eastAsia="Times New Roman"/>
+          <w:noProof/>
+          <w:lang w:eastAsia="cs-CZ"/>
+        </w:rPr>
+        <w:t xml:space="preserve"> a </w:t>
+      </w:r>
+      <w:r>
+        <w:rPr>
+          <w:rFonts w:eastAsia="Times New Roman"/>
+          <w:noProof/>
+          <w:lang w:eastAsia="cs-CZ"/>
+        </w:rPr>
+        <w:t>extrahuje</w:t>
+      </w:r>
+      <w:r>
+        <w:rPr>
+          <w:rFonts w:eastAsia="Times New Roman"/>
+          <w:noProof/>
+          <w:lang w:eastAsia="cs-CZ"/>
+        </w:rPr>
+        <w:t xml:space="preserve"> hardskills.</w:t>
+      </w:r>
+    </w:p>
+    <w:p>
+      <w:pPr>
+        <w:rPr>
+          <w:rFonts w:eastAsia="Times New Roman"/>
+          <w:noProof/>
+          <w:lang w:eastAsia="cs-CZ"/>
+        </w:rPr>
+      </w:pPr>
+      <w:r>
+        <w:rPr>
+          <w:rFonts w:eastAsia="Times New Roman"/>
+          <w:noProof/>
+          <w:lang w:eastAsia="cs-CZ"/>
+        </w:rPr>
+        <w:t>Tento postup kombinuje kontextové porozumění textu pomocí velkých jazykových modelů (LLM) s reálně a deterministicky identifikovanými AI dovednostmi v textu pracovní nabídky.</w:t>
+      </w:r>
+    </w:p>
+    <w:p>
+      <w:pPr>
+        <w:rPr>
+          <w:rFonts w:eastAsia="Times New Roman"/>
+          <w:noProof/>
+          <w:lang w:eastAsia="cs-CZ"/>
+        </w:rPr>
+      </w:pPr>
+      <w:r>
+        <w:rPr>
+          <w:rFonts w:eastAsia="Times New Roman"/>
+          <w:noProof/>
+          <w:lang w:eastAsia="cs-CZ"/>
+        </w:rPr>
+        <w:t xml:space="preserve">Pro kvalitní a smysluplnou analýzu je v datech kladen velký důraz na vyhodnocení, zda </w:t>
+      </w:r>
+      <w:r>
+        <w:rPr>
+          <w:rFonts w:eastAsia="Times New Roman"/>
+          <w:noProof/>
+          <w:lang w:eastAsia="cs-CZ"/>
+        </w:rPr>
+        <w:t>daný inzerát je skutečně práce s AI či nikoliv, jeli</w:t>
+      </w:r>
+      <w:r>
+        <w:rPr>
+          <w:rFonts w:eastAsia="Times New Roman"/>
+          <w:noProof/>
+          <w:lang w:eastAsia="cs-CZ"/>
+        </w:rPr>
+        <w:t>ko</w:t>
+      </w:r>
+      <w:r>
+        <w:rPr>
+          <w:rFonts w:eastAsia="Times New Roman"/>
+          <w:noProof/>
+          <w:lang w:eastAsia="cs-CZ"/>
+        </w:rPr>
+        <w:t>ž</w:t>
+      </w:r>
+      <w:r>
+        <w:rPr>
+          <w:rFonts w:eastAsia="Times New Roman"/>
+          <w:noProof/>
+          <w:lang w:eastAsia="cs-CZ"/>
+        </w:rPr>
+        <w:t xml:space="preserve"> zde </w:t>
+      </w:r>
+      <w:r>
+        <w:rPr>
+          <w:rFonts w:eastAsia="Times New Roman"/>
+          <w:noProof/>
+          <w:lang w:eastAsia="cs-CZ"/>
+        </w:rPr>
+        <w:t>dle nátury popisu inzerátů existuje</w:t>
+      </w:r>
+      <w:r>
+        <w:rPr>
+          <w:rFonts w:eastAsia="Times New Roman"/>
+          <w:noProof/>
+          <w:lang w:eastAsia="cs-CZ"/>
+        </w:rPr>
+        <w:t xml:space="preserve"> spou</w:t>
+      </w:r>
+      <w:r>
+        <w:rPr>
+          <w:rFonts w:eastAsia="Times New Roman"/>
+          <w:noProof/>
+          <w:lang w:eastAsia="cs-CZ"/>
+        </w:rPr>
+        <w:t>sta rizikových</w:t>
+      </w:r>
+      <w:r>
+        <w:rPr>
+          <w:rFonts w:eastAsia="Times New Roman"/>
+          <w:noProof/>
+          <w:lang w:eastAsia="cs-CZ"/>
+        </w:rPr>
+        <w:t xml:space="preserve"> false positive</w:t>
+      </w:r>
+      <w:r>
+        <w:rPr>
+          <w:rFonts w:eastAsia="Times New Roman"/>
+          <w:noProof/>
+          <w:lang w:eastAsia="cs-CZ"/>
+        </w:rPr>
+        <w:t>,</w:t>
+      </w:r>
+      <w:r>
+        <w:rPr>
+          <w:rFonts w:eastAsia="Times New Roman"/>
+          <w:noProof/>
+          <w:lang w:eastAsia="cs-CZ"/>
+        </w:rPr>
+        <w:t xml:space="preserve"> které je třeba vyfiltrovat a správně zařadit.</w:t>
+      </w:r>
+      <w:r>
+        <w:rPr>
+          <w:rFonts w:eastAsia="Times New Roman"/>
+          <w:noProof/>
+          <w:lang w:eastAsia="cs-CZ"/>
+        </w:rPr>
+        <w:t xml:space="preserve"> Jedná se o inzeráty, které obsahují spoustu AI terminologie a na první pohled se můžou zdát jako zřejmým kandidátem, </w:t>
+      </w:r>
+      <w:r>
+        <w:rPr>
+          <w:rFonts w:eastAsia="Times New Roman"/>
+          <w:noProof/>
+          <w:lang w:eastAsia="cs-CZ"/>
+        </w:rPr>
+        <w:t>často</w:t>
+      </w:r>
+      <w:r>
+        <w:rPr>
+          <w:rFonts w:eastAsia="Times New Roman"/>
+          <w:noProof/>
+          <w:lang w:eastAsia="cs-CZ"/>
+        </w:rPr>
+        <w:t xml:space="preserve"> jsou to však AI startupy a firmy, jejichž produkt může být klidně AI, ale konkrétní pracovní pozice v inzerátu je například obyčejný vývoj webu či aplikace pro tento produkt, či nějaký sekundární produkt, nebo produkt pro interní použití ve firmě.</w:t>
+      </w:r>
+      <w:r>
+        <w:rPr>
+          <w:rFonts w:eastAsia="Times New Roman"/>
+          <w:noProof/>
+          <w:lang w:eastAsia="cs-CZ"/>
+        </w:rPr>
+        <w:t xml:space="preserve"> Z </w:t>
+      </w:r>
+      <w:r>
+        <w:rPr>
+          <w:rFonts w:eastAsia="Times New Roman"/>
+          <w:noProof/>
+          <w:lang w:eastAsia="cs-CZ"/>
+        </w:rPr>
+        <w:t>toho</w:t>
+      </w:r>
+      <w:r>
+        <w:rPr>
+          <w:rFonts w:eastAsia="Times New Roman"/>
+          <w:noProof/>
+          <w:lang w:eastAsia="cs-CZ"/>
+        </w:rPr>
+        <w:t>to důvodu</w:t>
+      </w:r>
+      <w:r>
+        <w:rPr>
+          <w:rFonts w:eastAsia="Times New Roman"/>
+          <w:noProof/>
+          <w:lang w:eastAsia="cs-CZ"/>
+        </w:rPr>
+        <w:t xml:space="preserve"> byly vytvořena proměnná is</w:t>
+      </w:r>
+      <w:r>
+        <w:rPr>
+          <w:rFonts w:eastAsia="Times New Roman"/>
+          <w:noProof/>
+          <w:lang w:eastAsia="cs-CZ"/>
+        </w:rPr>
+        <w:t>_</w:t>
+      </w:r>
+      <w:r>
+        <w:rPr>
+          <w:rFonts w:eastAsia="Times New Roman"/>
+          <w:noProof/>
+          <w:lang w:eastAsia="cs-CZ"/>
+        </w:rPr>
+        <w:t>real</w:t>
+      </w:r>
+      <w:r>
+        <w:rPr>
+          <w:rFonts w:eastAsia="Times New Roman"/>
+          <w:noProof/>
+          <w:lang w:eastAsia="cs-CZ"/>
+        </w:rPr>
+        <w:t>_</w:t>
+      </w:r>
+      <w:r>
+        <w:rPr>
+          <w:rFonts w:eastAsia="Times New Roman"/>
+          <w:noProof/>
+          <w:lang w:eastAsia="cs-CZ"/>
+        </w:rPr>
+        <w:t>ai s kategoriemi něco až něco popsat.</w:t>
+      </w:r>
+    </w:p>
+    <w:p>
+      <w:pPr>
+        <w:pStyle w:val="Heading2"/>
+        <w:rPr>
+          <w:noProof/>
+        </w:rPr>
+      </w:pPr>
+      <w:bookmarkStart w:id="70" w:name="_Toc225722877"/>
+      <w:r>
+        <w:rPr>
+          <w:noProof/>
+        </w:rPr>
+        <w:t xml:space="preserve">Struktura datasetu a </w:t>
+      </w:r>
+      <w:r>
+        <w:rPr>
+          <w:noProof/>
+        </w:rPr>
+        <w:t>konstrukce</w:t>
+      </w:r>
+      <w:r>
+        <w:rPr>
+          <w:noProof/>
+        </w:rPr>
+        <w:t xml:space="preserve"> proměnných</w:t>
+      </w:r>
       <w:bookmarkEnd w:id="70"/>
-      <w:r>
-        <w:rPr>
-          <w:rFonts w:ascii="Times New Roman" w:eastAsia="Times New Roman" w:hAnsi="Times New Roman" w:cs="Times New Roman"/>
-          <w:noProof/>
-          <w:lang w:eastAsia="cs-CZ"/>
-        </w:rPr>
-        <w:t>. Embeddingy v projektu spojují duplicity (sémantický matching): Poznají například, že "Python 3" a "Python" nebo "JS" a "JavaScript" jsou to samé, a ve výsledku to sjednotí. Dále třídí nové věci (auto-kategorizace): Když AI najde novou dovednost, která ještě není ve slovníku, vektory odhadnou podle významu, do jaké skupiny drtivou většinou patří (např. neznámý framework zařadí mezi "frontend").</w:t>
-      </w:r>
-    </w:p>
-    <w:p>
-      <w:pPr>
-        <w:pStyle w:val="Title"/>
-        <w:rPr>
-          <w:rFonts w:eastAsia="Times New Roman"/>
-          <w:noProof/>
-          <w:lang w:eastAsia="cs-CZ"/>
-        </w:rPr>
-      </w:pPr>
-      <w:r>
-        <w:rPr>
-          <w:rFonts w:eastAsia="Times New Roman"/>
-          <w:noProof/>
-          <w:lang w:eastAsia="cs-CZ"/>
-        </w:rPr>
-        <w:t>Bottom-up přístup</w:t>
-      </w:r>
-    </w:p>
-    <w:p>
-      <w:pPr>
-        <w:rPr>
-          <w:noProof/>
-          <w:lang w:eastAsia="cs-CZ"/>
-        </w:rPr>
-      </w:pPr>
-    </w:p>
-    <w:p>
-      <w:pPr>
-        <w:rPr>
-          <w:noProof/>
-          <w:lang w:eastAsia="cs-CZ"/>
-        </w:rPr>
-      </w:pPr>
-      <w:r>
-        <w:rPr>
-          <w:noProof/>
-          <w:lang w:eastAsia="cs-CZ"/>
-        </w:rPr>
-        <w:t xml:space="preserve">Byl použit bottom-up přístup dle Bone at al, kdy pracovní pozice je klasifikována na základě </w:t>
-      </w:r>
-      <w:r>
-        <w:rPr>
-          <w:noProof/>
-          <w:lang w:eastAsia="cs-CZ"/>
-        </w:rPr>
-        <w:t>konkrétních dovedností (skills), které vyžadují, na rozdíl od toho, kdy by byla brána pozice automaticky jako práce s AI dle klasifikace inzerátu podle sektoru nebo odvětví.</w:t>
-      </w:r>
-    </w:p>
-    <w:p>
-      <w:pPr>
-        <w:rPr>
-          <w:noProof/>
-          <w:lang w:eastAsia="cs-CZ"/>
-        </w:rPr>
-      </w:pPr>
-      <w:r>
-        <w:rPr>
-          <w:noProof/>
-          <w:lang w:eastAsia="cs-CZ"/>
-        </w:rPr>
-        <w:t>Při použití tohoto „bottom-up“ přístupu je zaměstnanec AI společnosti považován za pracovníka v oblasti AI pouze tehdy, pokud jeho skutečné pracovní povinnosti zahrnují úkoly spojené s umělou inteligencí, jako je například trénování modelů strojového učení. Tento postup je kladen do protikladu k tzv. „top-down“ přístupu, který hodnotí pozice právě jen podle odvětví (např. automaticky považuje kohokoliv, kdo pracuje pro společnost zabývající se čistou energií, za člověka se „zelenou“ prací, i když jeho úkoly s ekologií nesouvisí).</w:t>
-      </w:r>
-    </w:p>
-    <w:p>
-      <w:pPr>
-        <w:rPr>
-          <w:noProof/>
-          <w:lang w:eastAsia="cs-CZ"/>
-        </w:rPr>
-      </w:pPr>
-      <w:r>
-        <w:rPr>
-          <w:noProof/>
-          <w:lang w:eastAsia="cs-CZ"/>
-        </w:rPr>
-        <w:t xml:space="preserve">Autoři studie </w:t>
-      </w:r>
-      <w:r>
-        <w:rPr>
-          <w:noProof/>
-          <w:lang w:eastAsia="cs-CZ"/>
-        </w:rPr>
-        <w:t xml:space="preserve">Bone et al </w:t>
-      </w:r>
-      <w:r>
-        <w:rPr>
-          <w:noProof/>
-          <w:lang w:eastAsia="cs-CZ"/>
-        </w:rPr>
-        <w:t xml:space="preserve">využívají přístup k přesné identifikaci a kategorizaci AI a „zelených“ pracovních míst. V praxi to znamená, že každý pracovní inzerát, který obsahoval alespoň jednu dovednost z oblasti AI, označili jako AI pozici, a inzerát </w:t>
-      </w:r>
-      <w:r>
-        <w:rPr>
-          <w:noProof/>
-          <w:lang w:eastAsia="cs-CZ"/>
-        </w:rPr>
-        <w:lastRenderedPageBreak/>
-        <w:t>vyžadující alespoň jednu „zelenou“ dovednost kategorizovali jako zelenou pozici, a to bez ohledu na to, v jakém hospodářském sektoru byla pozice inzerována.</w:t>
-      </w:r>
-    </w:p>
-    <w:p>
-      <w:pPr>
-        <w:rPr>
-          <w:rFonts w:eastAsia="Times New Roman"/>
-          <w:noProof/>
-          <w:lang w:eastAsia="cs-CZ"/>
-        </w:rPr>
-      </w:pPr>
-      <w:r>
-        <w:rPr>
-          <w:rFonts w:eastAsia="Times New Roman"/>
-          <w:noProof/>
-          <w:lang w:eastAsia="cs-CZ"/>
-        </w:rPr>
-        <w:t>V této práci se podobně automaticky nepředpokládá</w:t>
-      </w:r>
-      <w:r>
-        <w:rPr>
-          <w:rFonts w:eastAsia="Times New Roman"/>
-          <w:noProof/>
-          <w:lang w:eastAsia="cs-CZ"/>
-        </w:rPr>
-        <w:t>, že pozice s názvem či podobně je skutečně pozice s práci s AI v pravém slova smyslu, ale sleduje</w:t>
-      </w:r>
-      <w:r>
-        <w:rPr>
-          <w:rFonts w:eastAsia="Times New Roman"/>
-          <w:noProof/>
-          <w:lang w:eastAsia="cs-CZ"/>
-        </w:rPr>
-        <w:t xml:space="preserve"> se</w:t>
-      </w:r>
-      <w:r>
-        <w:rPr>
-          <w:rFonts w:eastAsia="Times New Roman"/>
-          <w:noProof/>
-          <w:lang w:eastAsia="cs-CZ"/>
-        </w:rPr>
-        <w:t xml:space="preserve"> a </w:t>
-      </w:r>
-      <w:r>
-        <w:rPr>
-          <w:rFonts w:eastAsia="Times New Roman"/>
-          <w:noProof/>
-          <w:lang w:eastAsia="cs-CZ"/>
-        </w:rPr>
-        <w:t>extrahuje</w:t>
-      </w:r>
-      <w:r>
-        <w:rPr>
-          <w:rFonts w:eastAsia="Times New Roman"/>
-          <w:noProof/>
-          <w:lang w:eastAsia="cs-CZ"/>
-        </w:rPr>
-        <w:t xml:space="preserve"> hardskills.</w:t>
-      </w:r>
-    </w:p>
-    <w:p>
-      <w:pPr>
-        <w:rPr>
-          <w:rFonts w:eastAsia="Times New Roman"/>
-          <w:noProof/>
-          <w:lang w:eastAsia="cs-CZ"/>
-        </w:rPr>
-      </w:pPr>
-      <w:r>
-        <w:rPr>
-          <w:rFonts w:eastAsia="Times New Roman"/>
-          <w:noProof/>
-          <w:lang w:eastAsia="cs-CZ"/>
-        </w:rPr>
-        <w:t>Tento postup kombinuje kontextové porozumění textu pomocí velkých jazykových modelů (LLM) s reálně a deterministicky identifikovanými AI dovednostmi v textu pracovní nabídky.</w:t>
-      </w:r>
-    </w:p>
-    <w:p>
-      <w:pPr>
-        <w:rPr>
-          <w:rFonts w:eastAsia="Times New Roman"/>
-          <w:noProof/>
-          <w:lang w:eastAsia="cs-CZ"/>
-        </w:rPr>
-      </w:pPr>
-      <w:r>
-        <w:rPr>
-          <w:rFonts w:eastAsia="Times New Roman"/>
-          <w:noProof/>
-          <w:lang w:eastAsia="cs-CZ"/>
-        </w:rPr>
-        <w:t xml:space="preserve">Pro kvalitní a smysluplnou analýzu je v datech kladen velký důraz na vyhodnocení, zda </w:t>
-      </w:r>
-      <w:r>
-        <w:rPr>
-          <w:rFonts w:eastAsia="Times New Roman"/>
-          <w:noProof/>
-          <w:lang w:eastAsia="cs-CZ"/>
-        </w:rPr>
-        <w:t>daný inzerát je skutečně práce s AI či nikoliv, jeli</w:t>
-      </w:r>
-      <w:r>
-        <w:rPr>
-          <w:rFonts w:eastAsia="Times New Roman"/>
-          <w:noProof/>
-          <w:lang w:eastAsia="cs-CZ"/>
-        </w:rPr>
-        <w:t>ko</w:t>
-      </w:r>
-      <w:r>
-        <w:rPr>
-          <w:rFonts w:eastAsia="Times New Roman"/>
-          <w:noProof/>
-          <w:lang w:eastAsia="cs-CZ"/>
-        </w:rPr>
-        <w:t>ž</w:t>
-      </w:r>
-      <w:r>
-        <w:rPr>
-          <w:rFonts w:eastAsia="Times New Roman"/>
-          <w:noProof/>
-          <w:lang w:eastAsia="cs-CZ"/>
-        </w:rPr>
-        <w:t xml:space="preserve"> zde </w:t>
-      </w:r>
-      <w:r>
-        <w:rPr>
-          <w:rFonts w:eastAsia="Times New Roman"/>
-          <w:noProof/>
-          <w:lang w:eastAsia="cs-CZ"/>
-        </w:rPr>
-        <w:t>dle nátury popisu inzerátů existuje</w:t>
-      </w:r>
-      <w:r>
-        <w:rPr>
-          <w:rFonts w:eastAsia="Times New Roman"/>
-          <w:noProof/>
-          <w:lang w:eastAsia="cs-CZ"/>
-        </w:rPr>
-        <w:t xml:space="preserve"> spou</w:t>
-      </w:r>
-      <w:r>
-        <w:rPr>
-          <w:rFonts w:eastAsia="Times New Roman"/>
-          <w:noProof/>
-          <w:lang w:eastAsia="cs-CZ"/>
-        </w:rPr>
-        <w:t>sta rizikových</w:t>
-      </w:r>
-      <w:r>
-        <w:rPr>
-          <w:rFonts w:eastAsia="Times New Roman"/>
-          <w:noProof/>
-          <w:lang w:eastAsia="cs-CZ"/>
-        </w:rPr>
-        <w:t xml:space="preserve"> false positive</w:t>
-      </w:r>
-      <w:r>
-        <w:rPr>
-          <w:rFonts w:eastAsia="Times New Roman"/>
-          <w:noProof/>
-          <w:lang w:eastAsia="cs-CZ"/>
-        </w:rPr>
-        <w:t>,</w:t>
-      </w:r>
-      <w:r>
-        <w:rPr>
-          <w:rFonts w:eastAsia="Times New Roman"/>
-          <w:noProof/>
-          <w:lang w:eastAsia="cs-CZ"/>
-        </w:rPr>
-        <w:t xml:space="preserve"> které je třeba vyfiltrovat a správně zařadit.</w:t>
-      </w:r>
-      <w:r>
-        <w:rPr>
-          <w:rFonts w:eastAsia="Times New Roman"/>
-          <w:noProof/>
-          <w:lang w:eastAsia="cs-CZ"/>
-        </w:rPr>
-        <w:t xml:space="preserve"> Jedná se o inzeráty, které obsahují spoustu AI terminologie a na první pohled se můžou zdát jako zřejmým kandidátem, </w:t>
-      </w:r>
-      <w:r>
-        <w:rPr>
-          <w:rFonts w:eastAsia="Times New Roman"/>
-          <w:noProof/>
-          <w:lang w:eastAsia="cs-CZ"/>
-        </w:rPr>
-        <w:t>často</w:t>
-      </w:r>
-      <w:r>
-        <w:rPr>
-          <w:rFonts w:eastAsia="Times New Roman"/>
-          <w:noProof/>
-          <w:lang w:eastAsia="cs-CZ"/>
-        </w:rPr>
-        <w:t xml:space="preserve"> jsou to však AI startupy a firmy, jejichž produkt může být klidně AI, ale konkrétní pracovní pozice v inzerátu je například obyčejný vývoj webu či aplikace pro tento produkt, či nějaký sekundární produkt, nebo produkt pro interní použití ve firmě.</w:t>
-      </w:r>
-      <w:r>
-        <w:rPr>
-          <w:rFonts w:eastAsia="Times New Roman"/>
-          <w:noProof/>
-          <w:lang w:eastAsia="cs-CZ"/>
-        </w:rPr>
-        <w:t xml:space="preserve"> Z </w:t>
-      </w:r>
-      <w:r>
-        <w:rPr>
-          <w:rFonts w:eastAsia="Times New Roman"/>
-          <w:noProof/>
-          <w:lang w:eastAsia="cs-CZ"/>
-        </w:rPr>
-        <w:t>toho</w:t>
-      </w:r>
-      <w:r>
-        <w:rPr>
-          <w:rFonts w:eastAsia="Times New Roman"/>
-          <w:noProof/>
-          <w:lang w:eastAsia="cs-CZ"/>
-        </w:rPr>
-        <w:t>to důvodu</w:t>
-      </w:r>
-      <w:r>
-        <w:rPr>
-          <w:rFonts w:eastAsia="Times New Roman"/>
-          <w:noProof/>
-          <w:lang w:eastAsia="cs-CZ"/>
-        </w:rPr>
-        <w:t xml:space="preserve"> byly vytvořena proměnná is</w:t>
-      </w:r>
-      <w:r>
-        <w:rPr>
-          <w:rFonts w:eastAsia="Times New Roman"/>
-          <w:noProof/>
-          <w:lang w:eastAsia="cs-CZ"/>
-        </w:rPr>
-        <w:t>_</w:t>
-      </w:r>
-      <w:r>
-        <w:rPr>
-          <w:rFonts w:eastAsia="Times New Roman"/>
-          <w:noProof/>
-          <w:lang w:eastAsia="cs-CZ"/>
-        </w:rPr>
-        <w:t>real</w:t>
-      </w:r>
-      <w:r>
-        <w:rPr>
-          <w:rFonts w:eastAsia="Times New Roman"/>
-          <w:noProof/>
-          <w:lang w:eastAsia="cs-CZ"/>
-        </w:rPr>
-        <w:t>_</w:t>
-      </w:r>
-      <w:r>
-        <w:rPr>
-          <w:rFonts w:eastAsia="Times New Roman"/>
-          <w:noProof/>
-          <w:lang w:eastAsia="cs-CZ"/>
-        </w:rPr>
-        <w:t>ai s kategoriemi něco až něco popsat.</w:t>
-      </w:r>
-    </w:p>
-    <w:p>
-      <w:pPr>
-        <w:pStyle w:val="Heading2"/>
-        <w:rPr>
-          <w:noProof/>
-        </w:rPr>
-      </w:pPr>
-      <w:bookmarkStart w:id="71" w:name="_Toc223961409"/>
-      <w:r>
-        <w:rPr>
-          <w:noProof/>
-        </w:rPr>
-        <w:t>Struktura datasetu a popis proměnných</w:t>
-      </w:r>
-      <w:bookmarkEnd w:id="71"/>
     </w:p>
     <w:p>
       <w:pPr>
@@ -15558,14 +15880,14 @@
           <w:noProof/>
         </w:rPr>
       </w:pPr>
-      <w:bookmarkStart w:id="72" w:name="_Toc223961410"/>
+      <w:bookmarkStart w:id="71" w:name="_Toc225722878"/>
       <w:r>
         <w:rPr>
           <w:noProof/>
         </w:rPr>
         <w:t>Identifikační a kontextové proměnné</w:t>
       </w:r>
-      <w:bookmarkEnd w:id="72"/>
+      <w:bookmarkEnd w:id="71"/>
     </w:p>
     <w:p>
       <w:pPr>
@@ -15607,7 +15929,14 @@
         <w:rPr>
           <w:noProof/>
         </w:rPr>
-        <w:t xml:space="preserve"> či a</w:t>
+        <w:t xml:space="preserve"> či </w:t>
+      </w:r>
+      <w:r>
+        <w:rPr>
+          <w:noProof/>
+        </w:rPr>
+        <w:lastRenderedPageBreak/>
+        <w:t>a</w:t>
       </w:r>
       <w:r>
         <w:rPr>
@@ -15697,14 +16026,7 @@
         <w:rPr>
           <w:noProof/>
         </w:rPr>
-        <w:t xml:space="preserve">přiřazení do širšího </w:t>
-      </w:r>
-      <w:r>
-        <w:rPr>
-          <w:noProof/>
-        </w:rPr>
-        <w:lastRenderedPageBreak/>
-        <w:t>makroregionu v rámci USA</w:t>
+        <w:t>přiřazení do širšího makroregionu v rámci USA</w:t>
       </w:r>
       <w:r>
         <w:rPr>
@@ -15804,14 +16126,14 @@
           <w:noProof/>
         </w:rPr>
       </w:pPr>
-      <w:bookmarkStart w:id="73" w:name="_Toc223961411"/>
+      <w:bookmarkStart w:id="72" w:name="_Toc225722879"/>
       <w:r>
         <w:rPr>
           <w:noProof/>
         </w:rPr>
         <w:t>Dovednosti a AI klasifikace</w:t>
       </w:r>
-      <w:bookmarkEnd w:id="73"/>
+      <w:bookmarkEnd w:id="72"/>
     </w:p>
     <w:p>
       <w:pPr>
@@ -15956,7 +16278,7 @@
         </w:rPr>
         <w:t xml:space="preserve">: </w:t>
       </w:r>
-      <w:bookmarkStart w:id="74" w:name="_Hlk223964360"/>
+      <w:bookmarkStart w:id="73" w:name="_Hlk223964360"/>
       <w:r>
         <w:rPr>
           <w:noProof/>
@@ -15964,7 +16286,7 @@
         </w:rPr>
         <w:t>Původní název pracovní pozice tak, jak byl uveden v inzerátu</w:t>
       </w:r>
-      <w:bookmarkEnd w:id="74"/>
+      <w:bookmarkEnd w:id="73"/>
       <w:r>
         <w:rPr>
           <w:noProof/>
@@ -15997,7 +16319,7 @@
         </w:rPr>
         <w:t xml:space="preserve">: </w:t>
       </w:r>
-      <w:bookmarkStart w:id="75" w:name="_Hlk223964384"/>
+      <w:bookmarkStart w:id="74" w:name="_Hlk223964384"/>
       <w:r>
         <w:rPr>
           <w:noProof/>
@@ -16005,7 +16327,7 @@
         </w:rPr>
         <w:t xml:space="preserve">Agregované profesní skupiny odvozená z názvu pozice </w:t>
       </w:r>
-      <w:bookmarkEnd w:id="75"/>
+      <w:bookmarkEnd w:id="74"/>
       <w:r>
         <w:rPr>
           <w:noProof/>
@@ -16038,7 +16360,7 @@
         </w:rPr>
         <w:t xml:space="preserve">: Informace o americkém státě a </w:t>
       </w:r>
-      <w:bookmarkStart w:id="76" w:name="_Hlk223964665"/>
+      <w:bookmarkStart w:id="75" w:name="_Hlk223964665"/>
       <w:r>
         <w:rPr>
           <w:noProof/>
@@ -16046,23 +16368,23 @@
         </w:rPr>
         <w:t xml:space="preserve">přiřazení do širšího makroregionu v rámci USA </w:t>
       </w:r>
+      <w:bookmarkEnd w:id="75"/>
+      <w:r>
+        <w:rPr>
+          <w:noProof/>
+          <w:color w:val="EE0000"/>
+        </w:rPr>
+        <w:t xml:space="preserve">dle místního zvyklého rozdělní pro texty a analýzy ohledně trhu práce (US Census region – </w:t>
+      </w:r>
+      <w:bookmarkStart w:id="76" w:name="_Hlk223964645"/>
+      <w:r>
+        <w:rPr>
+          <w:noProof/>
+          <w:color w:val="EE0000"/>
+        </w:rPr>
+        <w:t>Northeast, Midwest, South, West</w:t>
+      </w:r>
       <w:bookmarkEnd w:id="76"/>
-      <w:r>
-        <w:rPr>
-          <w:noProof/>
-          <w:color w:val="EE0000"/>
-        </w:rPr>
-        <w:t xml:space="preserve">dle místního zvyklého rozdělní pro texty a analýzy ohledně trhu práce (US Census region – </w:t>
-      </w:r>
-      <w:bookmarkStart w:id="77" w:name="_Hlk223964645"/>
-      <w:r>
-        <w:rPr>
-          <w:noProof/>
-          <w:color w:val="EE0000"/>
-        </w:rPr>
-        <w:t>Northeast, Midwest, South, West</w:t>
-      </w:r>
-      <w:bookmarkEnd w:id="77"/>
       <w:r>
         <w:rPr>
           <w:noProof/>
@@ -16132,13 +16454,21 @@
           <w:noProof/>
           <w:color w:val="EE0000"/>
         </w:rPr>
-        <w:t>roměnné vznikly robustním deterministickým párováním textu inzerátů a metadat proti předem definovanému slovníku (</w:t>
+        <w:t xml:space="preserve">roměnné vznikly robustním deterministickým párováním textu inzerátů </w:t>
       </w:r>
       <w:r>
         <w:rPr>
           <w:noProof/>
           <w:color w:val="EE0000"/>
         </w:rPr>
+        <w:lastRenderedPageBreak/>
+        <w:t>a metadat proti předem definovanému slovníku (</w:t>
+      </w:r>
+      <w:r>
+        <w:rPr>
+          <w:noProof/>
+          <w:color w:val="EE0000"/>
+        </w:rPr>
         <w:t xml:space="preserve">po zvážení kvůli rychlosti, efektivitě a nákladů </w:t>
       </w:r>
       <w:r>
@@ -16153,25 +16483,17 @@
           <w:noProof/>
           <w:color w:val="EE0000"/>
         </w:rPr>
-        <w:t xml:space="preserve"> Deterministický </w:t>
-      </w:r>
+        <w:t xml:space="preserve"> Deterministický přístup stále dokáže extrahovat naprostou většinu kolem 92 procent skillů zcela, a to tak, že </w:t>
+      </w:r>
+      <w:bookmarkStart w:id="77" w:name="_Hlk223970037"/>
       <w:r>
         <w:rPr>
           <w:noProof/>
           <w:color w:val="EE0000"/>
         </w:rPr>
-        <w:lastRenderedPageBreak/>
-        <w:t xml:space="preserve">přístup stále dokáže extrahovat naprostou většinu kolem 92 procent skillů zcela, a to tak, že </w:t>
-      </w:r>
-      <w:bookmarkStart w:id="78" w:name="_Hlk223970037"/>
-      <w:r>
-        <w:rPr>
-          <w:noProof/>
-          <w:color w:val="EE0000"/>
-        </w:rPr>
         <w:t>slovník by vytvořen přímo z velkého vzorku kolem 5000 inzerátů</w:t>
       </w:r>
-      <w:bookmarkEnd w:id="78"/>
+      <w:bookmarkEnd w:id="77"/>
       <w:r>
         <w:rPr>
           <w:noProof/>
@@ -16432,14 +16754,14 @@
           <w:noProof/>
         </w:rPr>
       </w:pPr>
-      <w:bookmarkStart w:id="79" w:name="_Toc223961412"/>
+      <w:bookmarkStart w:id="78" w:name="_Toc225722880"/>
       <w:r>
         <w:rPr>
           <w:noProof/>
         </w:rPr>
         <w:t>Vzdělání a praxe</w:t>
       </w:r>
-      <w:bookmarkEnd w:id="79"/>
+      <w:bookmarkEnd w:id="78"/>
     </w:p>
     <w:p>
       <w:pPr>
@@ -16497,7 +16819,14 @@
         <w:rPr>
           <w:noProof/>
         </w:rPr>
-        <w:t xml:space="preserve"> minimální zmíněnou úroveň vzdělání (od hodnoty 0 pro neuvedené, 3 pro bakalářský stupeň, až po doktorát s hodnotou 5).</w:t>
+        <w:t xml:space="preserve"> minimální zmíněnou úroveň </w:t>
+      </w:r>
+      <w:r>
+        <w:rPr>
+          <w:noProof/>
+        </w:rPr>
+        <w:lastRenderedPageBreak/>
+        <w:t>vzdělání (od hodnoty 0 pro neuvedené, 3 pro bakalářský stupeň, až po doktorát s hodnotou 5).</w:t>
       </w:r>
     </w:p>
     <w:p>
@@ -16513,7 +16842,6 @@
           <w:b/>
           <w:noProof/>
         </w:rPr>
-        <w:lastRenderedPageBreak/>
         <w:t>experience_min_llm a exp_category</w:t>
       </w:r>
       <w:r>
@@ -16535,14 +16863,14 @@
           <w:noProof/>
         </w:rPr>
       </w:pPr>
-      <w:bookmarkStart w:id="80" w:name="_Toc223961413"/>
+      <w:bookmarkStart w:id="79" w:name="_Toc225722881"/>
       <w:r>
         <w:rPr>
           <w:noProof/>
         </w:rPr>
         <w:t>Mzdové proměnné</w:t>
       </w:r>
-      <w:bookmarkEnd w:id="80"/>
+      <w:bookmarkEnd w:id="79"/>
     </w:p>
     <w:p>
       <w:pPr>
@@ -16647,14 +16975,14 @@
           <w:noProof/>
         </w:rPr>
       </w:pPr>
-      <w:bookmarkStart w:id="81" w:name="_Toc223961414"/>
+      <w:bookmarkStart w:id="80" w:name="_Toc225722882"/>
       <w:r>
         <w:rPr>
           <w:noProof/>
         </w:rPr>
         <w:t>Firemní a sektorové atributy</w:t>
       </w:r>
-      <w:bookmarkEnd w:id="81"/>
+      <w:bookmarkEnd w:id="80"/>
     </w:p>
     <w:p>
       <w:pPr>
@@ -16912,19 +17240,202 @@
           <w:lang w:eastAsia="cs-CZ"/>
         </w:rPr>
       </w:pPr>
-      <w:bookmarkStart w:id="82" w:name="_Toc218852005"/>
-      <w:bookmarkStart w:id="83" w:name="_Toc223961415"/>
-      <w:bookmarkStart w:id="84" w:name="_Toc218852006"/>
+      <w:bookmarkStart w:id="81" w:name="_Toc218852005"/>
+      <w:bookmarkStart w:id="82" w:name="_Toc218852006"/>
+      <w:bookmarkStart w:id="83" w:name="_Toc225722883"/>
       <w:r>
         <w:rPr>
           <w:rFonts w:eastAsia="Times New Roman"/>
           <w:noProof/>
           <w:lang w:eastAsia="cs-CZ"/>
         </w:rPr>
-        <w:t>Analytické metody</w:t>
-      </w:r>
-      <w:bookmarkEnd w:id="82"/>
+        <w:t>cisteni a filtrace dat</w:t>
+      </w:r>
       <w:bookmarkEnd w:id="83"/>
+    </w:p>
+    <w:p>
+      <w:pPr>
+        <w:pStyle w:val="Heading2"/>
+        <w:rPr>
+          <w:rFonts w:eastAsia="Times New Roman"/>
+          <w:noProof/>
+          <w:lang w:eastAsia="cs-CZ"/>
+        </w:rPr>
+      </w:pPr>
+      <w:bookmarkStart w:id="84" w:name="_Toc225722884"/>
+      <w:bookmarkStart w:id="85" w:name="_Hlk225723504"/>
+      <w:r>
+        <w:rPr>
+          <w:rFonts w:eastAsia="Times New Roman"/>
+          <w:noProof/>
+          <w:lang w:eastAsia="cs-CZ"/>
+        </w:rPr>
+        <w:t>Ekonometrické</w:t>
+      </w:r>
+      <w:r>
+        <w:rPr>
+          <w:rFonts w:eastAsia="Times New Roman"/>
+          <w:noProof/>
+          <w:lang w:eastAsia="cs-CZ"/>
+        </w:rPr>
+        <w:t xml:space="preserve"> metody</w:t>
+      </w:r>
+      <w:bookmarkEnd w:id="81"/>
+      <w:bookmarkEnd w:id="84"/>
+    </w:p>
+    <w:p>
+      <w:pPr>
+        <w:pStyle w:val="BodyText"/>
+        <w:ind w:left="0" w:firstLine="0"/>
+        <w:rPr>
+          <w:lang w:eastAsia="cs-CZ"/>
+        </w:rPr>
+      </w:pPr>
+      <w:bookmarkStart w:id="86" w:name="_Hlk225723557"/>
+      <w:r>
+        <w:rPr>
+          <w:lang w:eastAsia="cs-CZ"/>
+        </w:rPr>
+        <w:t xml:space="preserve">Z ekonometrických metod byla použita </w:t>
+      </w:r>
+      <w:proofErr w:type="spellStart"/>
+      <w:r>
+        <w:rPr>
+          <w:lang w:eastAsia="cs-CZ"/>
+        </w:rPr>
+        <w:t>Mincerova</w:t>
+      </w:r>
+      <w:proofErr w:type="spellEnd"/>
+      <w:r>
+        <w:rPr>
+          <w:lang w:eastAsia="cs-CZ"/>
+        </w:rPr>
+        <w:t xml:space="preserve"> mzdová rovnice</w:t>
+      </w:r>
+      <w:r>
+        <w:rPr>
+          <w:lang w:eastAsia="cs-CZ"/>
+        </w:rPr>
+        <w:t xml:space="preserve"> rozšířenou o úrovni AI, dovedností a zaměstnání</w:t>
+      </w:r>
+      <w:r>
+        <w:rPr>
+          <w:lang w:eastAsia="cs-CZ"/>
+        </w:rPr>
+        <w:t xml:space="preserve">, jež užívá metodu </w:t>
+      </w:r>
+      <w:r>
+        <w:rPr>
+          <w:lang w:eastAsia="cs-CZ"/>
+        </w:rPr>
+        <w:t>OLS</w:t>
+      </w:r>
+      <w:r>
+        <w:rPr>
+          <w:lang w:eastAsia="cs-CZ"/>
+        </w:rPr>
+        <w:t xml:space="preserve"> (metoda nejmenších čtverců).</w:t>
+      </w:r>
+    </w:p>
+    <w:bookmarkEnd w:id="86"/>
+    <w:p>
+      <w:pPr>
+        <w:pStyle w:val="BodyText"/>
+        <w:ind w:left="0" w:firstLine="0"/>
+        <w:rPr>
+          <w:lang w:eastAsia="cs-CZ"/>
+        </w:rPr>
+      </w:pPr>
+      <w:r>
+        <w:rPr>
+          <w:lang w:eastAsia="cs-CZ"/>
+        </w:rPr>
+        <w:t>Dále byla v práci použita l</w:t>
+      </w:r>
+      <w:r>
+        <w:rPr>
+          <w:lang w:eastAsia="cs-CZ"/>
+        </w:rPr>
+        <w:t>ogistická regrese</w:t>
+      </w:r>
+      <w:r>
+        <w:rPr>
+          <w:lang w:eastAsia="cs-CZ"/>
+        </w:rPr>
+        <w:t xml:space="preserve"> (</w:t>
+      </w:r>
+      <w:proofErr w:type="spellStart"/>
+      <w:r>
+        <w:rPr>
+          <w:lang w:eastAsia="cs-CZ"/>
+        </w:rPr>
+        <w:t>mlogit</w:t>
+      </w:r>
+      <w:proofErr w:type="spellEnd"/>
+      <w:r>
+        <w:rPr>
+          <w:lang w:eastAsia="cs-CZ"/>
+        </w:rPr>
+        <w:t xml:space="preserve">), a </w:t>
+      </w:r>
+      <w:proofErr w:type="gramStart"/>
+      <w:r>
+        <w:rPr>
+          <w:lang w:eastAsia="cs-CZ"/>
+        </w:rPr>
+        <w:t>to .Při</w:t>
+      </w:r>
+      <w:proofErr w:type="gramEnd"/>
+      <w:r>
+        <w:rPr>
+          <w:lang w:eastAsia="cs-CZ"/>
+        </w:rPr>
+        <w:t xml:space="preserve"> užití pouze binárního </w:t>
+      </w:r>
+      <w:proofErr w:type="spellStart"/>
+      <w:r>
+        <w:rPr>
+          <w:lang w:eastAsia="cs-CZ"/>
+        </w:rPr>
+        <w:t>logitu</w:t>
+      </w:r>
+      <w:proofErr w:type="spellEnd"/>
+      <w:r>
+        <w:rPr>
+          <w:lang w:eastAsia="cs-CZ"/>
+        </w:rPr>
+        <w:t xml:space="preserve"> by se přišlo o cenná data díky rozdělení reálného užití AI do 3 kategorií.</w:t>
+      </w:r>
+    </w:p>
+    <w:p>
+      <w:pPr>
+        <w:pStyle w:val="BodyText"/>
+        <w:ind w:left="0" w:firstLine="0"/>
+        <w:rPr>
+          <w:lang w:eastAsia="cs-CZ"/>
+        </w:rPr>
+      </w:pPr>
+      <w:r>
+        <w:rPr>
+          <w:lang w:eastAsia="cs-CZ"/>
+        </w:rPr>
+        <w:t>Komparativní analýza</w:t>
+      </w:r>
+    </w:p>
+    <w:p>
+      <w:pPr>
+        <w:pStyle w:val="BodyText"/>
+        <w:ind w:left="0" w:firstLine="0"/>
+        <w:rPr>
+          <w:lang w:eastAsia="cs-CZ"/>
+        </w:rPr>
+      </w:pPr>
+      <w:r>
+        <w:rPr>
+          <w:lang w:eastAsia="cs-CZ"/>
+        </w:rPr>
+        <w:t>Citlivostní analýza</w:t>
+      </w:r>
     </w:p>
     <w:p>
       <w:pPr>
@@ -17001,17 +17512,26 @@
           <w:lang w:eastAsia="cs-CZ"/>
         </w:rPr>
       </w:pPr>
-      <w:bookmarkStart w:id="85" w:name="_Toc223961416"/>
+      <w:bookmarkStart w:id="87" w:name="_Toc225722885"/>
+      <w:bookmarkEnd w:id="85"/>
       <w:r>
         <w:rPr>
           <w:rFonts w:eastAsia="Times New Roman"/>
           <w:noProof/>
           <w:lang w:eastAsia="cs-CZ"/>
         </w:rPr>
-        <w:t>Omezení metodologie</w:t>
-      </w:r>
-      <w:bookmarkEnd w:id="84"/>
-      <w:bookmarkEnd w:id="85"/>
+        <w:t>Diagnostika a o</w:t>
+      </w:r>
+      <w:r>
+        <w:rPr>
+          <w:rFonts w:eastAsia="Times New Roman"/>
+          <w:noProof/>
+          <w:lang w:eastAsia="cs-CZ"/>
+        </w:rPr>
+        <w:t>mezení metodologie</w:t>
+      </w:r>
+      <w:bookmarkEnd w:id="82"/>
+      <w:bookmarkEnd w:id="87"/>
     </w:p>
     <w:p>
       <w:pPr>
@@ -17044,6 +17564,7 @@
           <w:rFonts w:eastAsia="Times New Roman"/>
           <w:noProof/>
         </w:rPr>
+        <w:lastRenderedPageBreak/>
         <w:t>Pracovní portály nejsou dokonalým odrazem celého trhu práce. Menší firmy nebo startupy mohou využívat jiné kanály (např. sítě na LinkedInu, doporučení), zatímco na Glassdooru mohou být nadreprezentovány větší korporace a IT firmy ve velkých technologických hubech (Silicon Valley apod.).</w:t>
       </w:r>
     </w:p>
@@ -17082,7 +17603,6 @@
           <w:rFonts w:eastAsia="Times New Roman"/>
           <w:noProof/>
         </w:rPr>
-        <w:lastRenderedPageBreak/>
         <w:t>Deterministická extrakce: I když je regulární matching (regex) přesný na klíčová slova, postrádá schopnost chápat kontext. Algoritmus například nemusí vždy spolehlivě poznat negaci (např. větu "Znalost Pythonu výhodou, nepoužíváme však TensorFlow" interpretuje jako poptávku po TensorFlow).</w:t>
       </w:r>
     </w:p>
@@ -17212,7 +17732,7 @@
           <w:lang w:eastAsia="cs-CZ"/>
         </w:rPr>
       </w:pPr>
-      <w:bookmarkStart w:id="86" w:name="_Toc218852007"/>
+      <w:bookmarkStart w:id="88" w:name="_Toc218852007"/>
       <w:r>
         <w:rPr>
           <w:rFonts w:eastAsia="Times New Roman"/>
@@ -17222,7 +17742,7 @@
         <w:lastRenderedPageBreak/>
         <w:t>AI dovednosti v inzerci IT pracovních pozic</w:t>
       </w:r>
-      <w:bookmarkEnd w:id="86"/>
+      <w:bookmarkEnd w:id="88"/>
     </w:p>
     <w:p>
       <w:pPr>
@@ -17242,8 +17762,8 @@
           <w:lang w:eastAsia="cs-CZ"/>
         </w:rPr>
       </w:pPr>
-      <w:bookmarkStart w:id="87" w:name="_Toc218852008"/>
-      <w:bookmarkStart w:id="88" w:name="_Toc223961417"/>
+      <w:bookmarkStart w:id="89" w:name="_Toc218852008"/>
+      <w:bookmarkStart w:id="90" w:name="_Toc225722886"/>
       <w:r>
         <w:rPr>
           <w:rFonts w:eastAsia="Times New Roman"/>
@@ -17252,8 +17772,8 @@
         </w:rPr>
         <w:t>Přehled datasetu</w:t>
       </w:r>
-      <w:bookmarkEnd w:id="87"/>
-      <w:bookmarkEnd w:id="88"/>
+      <w:bookmarkEnd w:id="89"/>
+      <w:bookmarkEnd w:id="90"/>
     </w:p>
     <w:p>
       <w:pPr>
@@ -17281,8 +17801,8 @@
           <w:lang w:eastAsia="cs-CZ"/>
         </w:rPr>
       </w:pPr>
-      <w:bookmarkStart w:id="89" w:name="_Toc218852009"/>
-      <w:bookmarkStart w:id="90" w:name="_Toc223961418"/>
+      <w:bookmarkStart w:id="91" w:name="_Toc218852009"/>
+      <w:bookmarkStart w:id="92" w:name="_Toc225722887"/>
       <w:r>
         <w:rPr>
           <w:rFonts w:eastAsia="Times New Roman"/>
@@ -17291,8 +17811,8 @@
         </w:rPr>
         <w:t>Identifikace a kategorizace AI dovedností</w:t>
       </w:r>
-      <w:bookmarkEnd w:id="89"/>
-      <w:bookmarkEnd w:id="90"/>
+      <w:bookmarkEnd w:id="91"/>
+      <w:bookmarkEnd w:id="92"/>
     </w:p>
     <w:p>
       <w:pPr>
@@ -17326,8 +17846,8 @@
           <w:lang w:eastAsia="cs-CZ"/>
         </w:rPr>
       </w:pPr>
-      <w:bookmarkStart w:id="91" w:name="_Toc218852010"/>
-      <w:bookmarkStart w:id="92" w:name="_Toc223961419"/>
+      <w:bookmarkStart w:id="93" w:name="_Toc218852010"/>
+      <w:bookmarkStart w:id="94" w:name="_Toc225722888"/>
       <w:r>
         <w:rPr>
           <w:rFonts w:eastAsia="Times New Roman"/>
@@ -17336,8 +17856,8 @@
         </w:rPr>
         <w:t>Rozložení AI pozic podle AI tier</w:t>
       </w:r>
-      <w:bookmarkEnd w:id="91"/>
-      <w:bookmarkEnd w:id="92"/>
+      <w:bookmarkEnd w:id="93"/>
+      <w:bookmarkEnd w:id="94"/>
     </w:p>
     <w:p>
       <w:pPr>
@@ -17355,14 +17875,23 @@
           <w:lang w:eastAsia="cs-CZ"/>
         </w:rPr>
       </w:pPr>
-      <w:bookmarkStart w:id="93" w:name="_Toc223961420"/>
+      <w:bookmarkStart w:id="95" w:name="_Toc225722889"/>
       <w:r>
         <w:rPr>
           <w:lang w:eastAsia="cs-CZ"/>
         </w:rPr>
         <w:t>Mzdová analýza</w:t>
       </w:r>
-      <w:bookmarkEnd w:id="93"/>
+      <w:r>
+        <w:rPr>
+          <w:lang w:eastAsia="cs-CZ"/>
+        </w:rPr>
+        <w:t xml:space="preserve"> (</w:t>
+      </w:r>
+      <w:r>
+        <w:t>OLS regrese — AI prémie na platu)</w:t>
+      </w:r>
+      <w:bookmarkEnd w:id="95"/>
     </w:p>
     <w:p>
       <w:pPr>
@@ -17380,7 +17909,7 @@
           <w:lang w:val="en-US"/>
         </w:rPr>
       </w:pPr>
-      <w:bookmarkStart w:id="94" w:name="_Toc223961421"/>
+      <w:bookmarkStart w:id="96" w:name="_Toc225722890"/>
       <w:proofErr w:type="spellStart"/>
       <w:r>
         <w:rPr>
@@ -17423,7 +17952,16 @@
         </w:rPr>
         <w:t>)</w:t>
       </w:r>
-      <w:bookmarkEnd w:id="94"/>
+      <w:r>
+        <w:rPr>
+          <w:lang w:val="en-US"/>
+        </w:rPr>
+        <w:t xml:space="preserve"> (</w:t>
+      </w:r>
+      <w:r>
+        <w:t>determinanty AI požadavku)</w:t>
+      </w:r>
+      <w:bookmarkEnd w:id="96"/>
     </w:p>
     <w:p>
       <w:pPr>
@@ -17443,8 +17981,8 @@
           <w:lang w:eastAsia="cs-CZ"/>
         </w:rPr>
       </w:pPr>
-      <w:bookmarkStart w:id="95" w:name="_Toc218852012"/>
-      <w:bookmarkStart w:id="96" w:name="_Toc223961422"/>
+      <w:bookmarkStart w:id="97" w:name="_Toc218852012"/>
+      <w:bookmarkStart w:id="98" w:name="_Toc225722891"/>
       <w:r>
         <w:rPr>
           <w:rFonts w:eastAsia="Times New Roman"/>
@@ -17469,8 +18007,8 @@
         </w:rPr>
         <w:t>AI</w:t>
       </w:r>
-      <w:bookmarkEnd w:id="95"/>
-      <w:bookmarkEnd w:id="96"/>
+      <w:bookmarkEnd w:id="97"/>
+      <w:bookmarkEnd w:id="98"/>
     </w:p>
     <w:p>
       <w:pPr>
@@ -17490,8 +18028,8 @@
           <w:lang w:eastAsia="cs-CZ"/>
         </w:rPr>
       </w:pPr>
-      <w:bookmarkStart w:id="97" w:name="_Toc218852013"/>
-      <w:bookmarkStart w:id="98" w:name="_Toc223961423"/>
+      <w:bookmarkStart w:id="99" w:name="_Toc218852013"/>
+      <w:bookmarkStart w:id="100" w:name="_Toc225722892"/>
       <w:r>
         <w:rPr>
           <w:rFonts w:eastAsia="Times New Roman"/>
@@ -17500,8 +18038,8 @@
         </w:rPr>
         <w:t>Vztah mezi AI dovednostmi a dalšími faktory</w:t>
       </w:r>
-      <w:bookmarkEnd w:id="97"/>
-      <w:bookmarkEnd w:id="98"/>
+      <w:bookmarkEnd w:id="99"/>
+      <w:bookmarkEnd w:id="100"/>
     </w:p>
     <w:p>
       <w:pPr>
@@ -17521,8 +18059,8 @@
           <w:lang w:eastAsia="cs-CZ"/>
         </w:rPr>
       </w:pPr>
-      <w:bookmarkStart w:id="99" w:name="_Toc218852014"/>
-      <w:bookmarkStart w:id="100" w:name="_Toc223961424"/>
+      <w:bookmarkStart w:id="101" w:name="_Toc218852014"/>
+      <w:bookmarkStart w:id="102" w:name="_Toc225722893"/>
       <w:r>
         <w:rPr>
           <w:rFonts w:eastAsia="Times New Roman"/>
@@ -17531,8 +18069,8 @@
         </w:rPr>
         <w:t>Sektor IT analýza?</w:t>
       </w:r>
-      <w:bookmarkEnd w:id="99"/>
-      <w:bookmarkEnd w:id="100"/>
+      <w:bookmarkEnd w:id="101"/>
+      <w:bookmarkEnd w:id="102"/>
     </w:p>
     <w:p>
       <w:pPr>
@@ -17552,8 +18090,8 @@
           <w:lang w:eastAsia="cs-CZ"/>
         </w:rPr>
       </w:pPr>
-      <w:bookmarkStart w:id="101" w:name="_Toc218852015"/>
-      <w:bookmarkStart w:id="102" w:name="_Toc223961425"/>
+      <w:bookmarkStart w:id="103" w:name="_Toc218852015"/>
+      <w:bookmarkStart w:id="104" w:name="_Toc225722894"/>
       <w:r>
         <w:rPr>
           <w:rFonts w:eastAsia="Times New Roman"/>
@@ -17563,8 +18101,16 @@
         <w:lastRenderedPageBreak/>
         <w:t>Diskuse výsledků</w:t>
       </w:r>
-      <w:bookmarkEnd w:id="101"/>
-      <w:bookmarkEnd w:id="102"/>
+      <w:bookmarkEnd w:id="103"/>
+      <w:r>
+        <w:rPr>
+          <w:rFonts w:eastAsia="Times New Roman"/>
+          <w:noProof/>
+          <w:lang w:eastAsia="cs-CZ"/>
+        </w:rPr>
+        <w:t xml:space="preserve"> a limitace</w:t>
+      </w:r>
+      <w:bookmarkEnd w:id="104"/>
     </w:p>
     <w:p>
       <w:pPr>
@@ -17578,7 +18124,7 @@
           <w:lang w:val="en-US"/>
         </w:rPr>
       </w:pPr>
-      <w:bookmarkStart w:id="103" w:name="_Toc223961426"/>
+      <w:bookmarkStart w:id="105" w:name="_Toc225722895"/>
       <w:proofErr w:type="spellStart"/>
       <w:r>
         <w:rPr>
@@ -17628,7 +18174,7 @@
         </w:rPr>
         <w:t>literatury</w:t>
       </w:r>
-      <w:bookmarkEnd w:id="103"/>
+      <w:bookmarkEnd w:id="105"/>
       <w:proofErr w:type="spellEnd"/>
     </w:p>
     <w:p>
@@ -17643,7 +18189,7 @@
           <w:lang w:val="en-US"/>
         </w:rPr>
       </w:pPr>
-      <w:bookmarkStart w:id="104" w:name="_Toc223961427"/>
+      <w:bookmarkStart w:id="106" w:name="_Toc225722896"/>
       <w:proofErr w:type="spellStart"/>
       <w:r>
         <w:rPr>
@@ -17658,7 +18204,7 @@
         </w:rPr>
         <w:t xml:space="preserve"> s Bone et al., Engberg et al.</w:t>
       </w:r>
-      <w:bookmarkEnd w:id="104"/>
+      <w:bookmarkEnd w:id="106"/>
     </w:p>
     <w:p>
       <w:pPr>
@@ -17672,7 +18218,7 @@
           <w:lang w:val="en-US"/>
         </w:rPr>
       </w:pPr>
-      <w:bookmarkStart w:id="105" w:name="_Toc223961428"/>
+      <w:bookmarkStart w:id="107" w:name="_Toc225722897"/>
       <w:proofErr w:type="spellStart"/>
       <w:r>
         <w:rPr>
@@ -17722,7 +18268,7 @@
         </w:rPr>
         <w:t>kapitálu</w:t>
       </w:r>
-      <w:bookmarkEnd w:id="105"/>
+      <w:bookmarkEnd w:id="107"/>
       <w:proofErr w:type="spellEnd"/>
     </w:p>
     <w:p>
@@ -17743,7 +18289,7 @@
           <w:lang w:eastAsia="cs-CZ"/>
         </w:rPr>
       </w:pPr>
-      <w:bookmarkStart w:id="106" w:name="_Toc218852016"/>
+      <w:bookmarkStart w:id="108" w:name="_Toc218852016"/>
       <w:r>
         <w:rPr>
           <w:rFonts w:eastAsia="Times New Roman"/>
@@ -17753,7 +18299,7 @@
         <w:lastRenderedPageBreak/>
         <w:t>Závěr</w:t>
       </w:r>
-      <w:bookmarkEnd w:id="106"/>
+      <w:bookmarkEnd w:id="108"/>
     </w:p>
     <w:p>
       <w:pPr>
@@ -17764,8 +18310,8 @@
           <w:lang w:eastAsia="cs-CZ"/>
         </w:rPr>
       </w:pPr>
-      <w:bookmarkStart w:id="107" w:name="_Toc218852017"/>
-      <w:bookmarkStart w:id="108" w:name="_Toc223961429"/>
+      <w:bookmarkStart w:id="109" w:name="_Toc218852017"/>
+      <w:bookmarkStart w:id="110" w:name="_Toc225722898"/>
       <w:r>
         <w:rPr>
           <w:rFonts w:eastAsia="Times New Roman"/>
@@ -17773,28 +18319,6 @@
           <w:lang w:eastAsia="cs-CZ"/>
         </w:rPr>
         <w:t>Shrnutí hlavních zjištění</w:t>
-      </w:r>
-      <w:bookmarkEnd w:id="107"/>
-      <w:bookmarkEnd w:id="108"/>
-    </w:p>
-    <w:p>
-      <w:pPr>
-        <w:pStyle w:val="Heading2"/>
-        <w:rPr>
-          <w:rFonts w:eastAsia="Times New Roman"/>
-          <w:noProof/>
-          <w:lang w:eastAsia="cs-CZ"/>
-        </w:rPr>
-      </w:pPr>
-      <w:bookmarkStart w:id="109" w:name="_Toc218852018"/>
-      <w:bookmarkStart w:id="110" w:name="_Toc223961430"/>
-      <w:r>
-        <w:rPr>
-          <w:rFonts w:eastAsia="Times New Roman"/>
-          <w:noProof/>
-          <w:lang w:eastAsia="cs-CZ"/>
-        </w:rPr>
-        <w:t>Teoretické implikace</w:t>
       </w:r>
       <w:bookmarkEnd w:id="109"/>
       <w:bookmarkEnd w:id="110"/>
@@ -17808,15 +18332,15 @@
           <w:lang w:eastAsia="cs-CZ"/>
         </w:rPr>
       </w:pPr>
-      <w:bookmarkStart w:id="111" w:name="_Toc218852019"/>
-      <w:bookmarkStart w:id="112" w:name="_Toc223961431"/>
+      <w:bookmarkStart w:id="111" w:name="_Toc218852018"/>
+      <w:bookmarkStart w:id="112" w:name="_Toc225722899"/>
       <w:r>
         <w:rPr>
           <w:rFonts w:eastAsia="Times New Roman"/>
           <w:noProof/>
           <w:lang w:eastAsia="cs-CZ"/>
         </w:rPr>
-        <w:t>Praktické implikace</w:t>
+        <w:t>Teoretické implikace</w:t>
       </w:r>
       <w:bookmarkEnd w:id="111"/>
       <w:bookmarkEnd w:id="112"/>
@@ -17830,21 +18354,43 @@
           <w:lang w:eastAsia="cs-CZ"/>
         </w:rPr>
       </w:pPr>
-      <w:bookmarkStart w:id="113" w:name="_Toc218852020"/>
-      <w:bookmarkStart w:id="114" w:name="_Toc223961432"/>
+      <w:bookmarkStart w:id="113" w:name="_Toc218852019"/>
+      <w:bookmarkStart w:id="114" w:name="_Toc225722900"/>
       <w:r>
         <w:rPr>
           <w:rFonts w:eastAsia="Times New Roman"/>
           <w:noProof/>
           <w:lang w:eastAsia="cs-CZ"/>
         </w:rPr>
-        <w:t>Náměty pro budoucí výzkum</w:t>
+        <w:t>Praktické implikace</w:t>
       </w:r>
       <w:bookmarkEnd w:id="113"/>
       <w:bookmarkEnd w:id="114"/>
     </w:p>
     <w:p>
       <w:pPr>
+        <w:pStyle w:val="Heading2"/>
+        <w:rPr>
+          <w:rFonts w:eastAsia="Times New Roman"/>
+          <w:noProof/>
+          <w:lang w:eastAsia="cs-CZ"/>
+        </w:rPr>
+      </w:pPr>
+      <w:bookmarkStart w:id="115" w:name="_Toc218852020"/>
+      <w:bookmarkStart w:id="116" w:name="_Toc225722901"/>
+      <w:r>
+        <w:rPr>
+          <w:rFonts w:eastAsia="Times New Roman"/>
+          <w:noProof/>
+          <w:lang w:eastAsia="cs-CZ"/>
+        </w:rPr>
+        <w:t>Náměty pro budoucí výzkum</w:t>
+      </w:r>
+      <w:bookmarkEnd w:id="115"/>
+      <w:bookmarkEnd w:id="116"/>
+    </w:p>
+    <w:p>
+      <w:pPr>
         <w:pStyle w:val="BodyText"/>
         <w:ind w:left="0" w:firstLine="0"/>
         <w:rPr>
@@ -17859,7 +18405,7 @@
           <w:noProof/>
         </w:rPr>
       </w:pPr>
-      <w:bookmarkStart w:id="115" w:name="_Toc22112413"/>
+      <w:bookmarkStart w:id="117" w:name="_Toc22112413"/>
       <w:r>
         <w:rPr>
           <w:noProof/>
@@ -17867,7 +18413,7 @@
         <w:lastRenderedPageBreak/>
         <w:t>Nadpis 1</w:t>
       </w:r>
-      <w:bookmarkEnd w:id="115"/>
+      <w:bookmarkEnd w:id="117"/>
     </w:p>
     <w:p>
       <w:pPr>
@@ -17876,34 +18422,34 @@
           <w:noProof/>
         </w:rPr>
       </w:pPr>
-      <w:bookmarkStart w:id="116" w:name="_Toc22112414"/>
-      <w:bookmarkStart w:id="117" w:name="_Toc223961433"/>
+      <w:bookmarkStart w:id="118" w:name="_Toc22112414"/>
+      <w:bookmarkStart w:id="119" w:name="_Toc225722902"/>
       <w:r>
         <w:rPr>
           <w:noProof/>
         </w:rPr>
         <w:t>Nadpis 2</w:t>
-      </w:r>
-      <w:bookmarkEnd w:id="116"/>
-      <w:bookmarkEnd w:id="117"/>
-    </w:p>
-    <w:p>
-      <w:pPr>
-        <w:pStyle w:val="Heading3"/>
-        <w:rPr>
-          <w:noProof/>
-        </w:rPr>
-      </w:pPr>
-      <w:bookmarkStart w:id="118" w:name="_Toc22112415"/>
-      <w:bookmarkStart w:id="119" w:name="_Toc223961434"/>
-      <w:r>
-        <w:rPr>
-          <w:noProof/>
-        </w:rPr>
-        <w:t>Nadpis 3</w:t>
       </w:r>
       <w:bookmarkEnd w:id="118"/>
       <w:bookmarkEnd w:id="119"/>
+    </w:p>
+    <w:p>
+      <w:pPr>
+        <w:pStyle w:val="Heading3"/>
+        <w:rPr>
+          <w:noProof/>
+        </w:rPr>
+      </w:pPr>
+      <w:bookmarkStart w:id="120" w:name="_Toc22112415"/>
+      <w:bookmarkStart w:id="121" w:name="_Toc225722903"/>
+      <w:r>
+        <w:rPr>
+          <w:noProof/>
+        </w:rPr>
+        <w:t>Nadpis 3</w:t>
+      </w:r>
+      <w:bookmarkEnd w:id="120"/>
+      <w:bookmarkEnd w:id="121"/>
     </w:p>
     <w:p>
       <w:pPr>
@@ -18106,14 +18652,14 @@
         </w:rPr>
         <w:t xml:space="preserve">Nad tímto textem je obrázek s titulkem, pod tímto textem je tabulka s titulkem. </w:t>
       </w:r>
-      <w:bookmarkStart w:id="120" w:name="_Hlk115687330"/>
+      <w:bookmarkStart w:id="122" w:name="_Hlk115687330"/>
       <w:r>
         <w:rPr>
           <w:noProof/>
         </w:rPr>
         <w:t>Pokud pracujete s grafem, použijte titulek pro obrázek.</w:t>
       </w:r>
-      <w:bookmarkEnd w:id="120"/>
+      <w:bookmarkEnd w:id="122"/>
     </w:p>
     <w:p>
       <w:pPr>
@@ -18378,7 +18924,7 @@
           <w:noProof/>
         </w:rPr>
       </w:pPr>
-      <w:bookmarkStart w:id="121" w:name="_Toc22112416"/>
+      <w:bookmarkStart w:id="123" w:name="_Toc22112416"/>
       <w:r>
         <w:rPr>
           <w:noProof/>
@@ -18386,7 +18932,7 @@
         <w:lastRenderedPageBreak/>
         <w:t>Závěr</w:t>
       </w:r>
-      <w:bookmarkEnd w:id="121"/>
+      <w:bookmarkEnd w:id="123"/>
     </w:p>
     <w:p>
       <w:pPr>
@@ -18831,7 +19377,7 @@
           <w:szCs w:val="24"/>
         </w:rPr>
       </w:pPr>
-      <w:bookmarkStart w:id="122" w:name="_Hlk147744544"/>
+      <w:bookmarkStart w:id="124" w:name="_Hlk147744544"/>
       <w:r>
         <w:rPr>
           <w:rFonts w:cstheme="minorHAnsi"/>
@@ -18895,7 +19441,7 @@
         <w:t>[cit. 2023-10-02].</w:t>
       </w:r>
     </w:p>
-    <w:bookmarkEnd w:id="122"/>
+    <w:bookmarkEnd w:id="124"/>
     <w:p>
       <w:pPr>
         <w:pStyle w:val="Seznampouitliteratury"/>
@@ -20892,9 +21438,9 @@
           <w:noProof/>
         </w:rPr>
       </w:pPr>
-      <w:bookmarkStart w:id="123" w:name="_Toc525301"/>
-      <w:bookmarkStart w:id="124" w:name="_Toc525338"/>
-      <w:bookmarkStart w:id="125" w:name="_Toc20732280"/>
+      <w:bookmarkStart w:id="125" w:name="_Toc525301"/>
+      <w:bookmarkStart w:id="126" w:name="_Toc525338"/>
+      <w:bookmarkStart w:id="127" w:name="_Toc20732280"/>
       <w:r>
         <w:rPr>
           <w:noProof/>
@@ -20902,9 +21448,9 @@
         <w:lastRenderedPageBreak/>
         <w:t>Příloha 1</w:t>
       </w:r>
-      <w:bookmarkEnd w:id="123"/>
-      <w:bookmarkEnd w:id="124"/>
       <w:bookmarkEnd w:id="125"/>
+      <w:bookmarkEnd w:id="126"/>
+      <w:bookmarkEnd w:id="127"/>
     </w:p>
     <w:p>
       <w:pPr>

</xml_diff>